<commit_message>
Revert "fix(backend): restore complete SaaS service"
This reverts commit 4c627acc4d165d9c51d4b0bca250f8c9a948aca5.
</commit_message>
<xml_diff>
--- a/tmp-lease-contract-smoke.docx
+++ b/tmp-lease-contract-smoke.docx
@@ -1,491 +1,2512 @@
 
 <file path=word/document.xml><?xml version="1.0" encoding="utf-8"?>
-<w:document xmlns:wpc="http://schemas.microsoft.com/office/word/2010/wordprocessingCanvas" xmlns:mc="http://schemas.openxmlformats.org/markup-compatibility/2006" xmlns:o="urn:schemas-microsoft-com:office:office" xmlns:r="http://schemas.openxmlformats.org/officeDocument/2006/relationships" xmlns:m="http://schemas.openxmlformats.org/officeDocument/2006/math" xmlns:v="urn:schemas-microsoft-com:vml" xmlns:wp14="http://schemas.microsoft.com/office/word/2010/wordprocessingDrawing" xmlns:wp="http://schemas.openxmlformats.org/drawingml/2006/wordprocessingDrawing" xmlns:w10="urn:schemas-microsoft-com:office:word" xmlns:w="http://schemas.openxmlformats.org/wordprocessingml/2006/main" xmlns:w14="http://schemas.microsoft.com/office/word/2010/wordml" xmlns:wpg="http://schemas.microsoft.com/office/word/2010/wordprocessingGroup" xmlns:wpi="http://schemas.microsoft.com/office/word/2010/wordprocessingInk" xmlns:wne="http://schemas.microsoft.com/office/word/2006/wordml" xmlns:wps="http://schemas.microsoft.com/office/word/2010/wordprocessingShape" mc:Ignorable="w14 wp14">
+<w:document xmlns:wpc="http://schemas.microsoft.com/office/word/2010/wordprocessingCanvas" xmlns:cx="http://schemas.microsoft.com/office/drawing/2014/chartex" xmlns:cx1="http://schemas.microsoft.com/office/drawing/2015/9/8/chartex" xmlns:cx2="http://schemas.microsoft.com/office/drawing/2015/10/21/chartex" xmlns:cx3="http://schemas.microsoft.com/office/drawing/2016/5/9/chartex" xmlns:cx4="http://schemas.microsoft.com/office/drawing/2016/5/10/chartex" xmlns:cx5="http://schemas.microsoft.com/office/drawing/2016/5/11/chartex" xmlns:cx6="http://schemas.microsoft.com/office/drawing/2016/5/12/chartex" xmlns:cx7="http://schemas.microsoft.com/office/drawing/2016/5/13/chartex" xmlns:cx8="http://schemas.microsoft.com/office/drawing/2016/5/14/chartex" xmlns:mc="http://schemas.openxmlformats.org/markup-compatibility/2006" xmlns:aink="http://schemas.microsoft.com/office/drawing/2016/ink" xmlns:am3d="http://schemas.microsoft.com/office/drawing/2017/model3d" xmlns:o="urn:schemas-microsoft-com:office:office" xmlns:oel="http://schemas.microsoft.com/office/2019/extlst" xmlns:r="http://schemas.openxmlformats.org/officeDocument/2006/relationships" xmlns:m="http://schemas.openxmlformats.org/officeDocument/2006/math" xmlns:v="urn:schemas-microsoft-com:vml" xmlns:wp14="http://schemas.microsoft.com/office/word/2010/wordprocessingDrawing" xmlns:wp="http://schemas.openxmlformats.org/drawingml/2006/wordprocessingDrawing" xmlns:w10="urn:schemas-microsoft-com:office:word" xmlns:w="http://schemas.openxmlformats.org/wordprocessingml/2006/main" xmlns:w14="http://schemas.microsoft.com/office/word/2010/wordml" xmlns:w15="http://schemas.microsoft.com/office/word/2012/wordml" xmlns:w16cex="http://schemas.microsoft.com/office/word/2018/wordml/cex" xmlns:w16cid="http://schemas.microsoft.com/office/word/2016/wordml/cid" xmlns:w16="http://schemas.microsoft.com/office/word/2018/wordml" xmlns:w16du="http://schemas.microsoft.com/office/word/2023/wordml/word16du" xmlns:w16sdtdh="http://schemas.microsoft.com/office/word/2020/wordml/sdtdatahash" xmlns:w16sdtfl="http://schemas.microsoft.com/office/word/2024/wordml/sdtformatlock" xmlns:w16se="http://schemas.microsoft.com/office/word/2015/wordml/symex" xmlns:wpg="http://schemas.microsoft.com/office/word/2010/wordprocessingGroup" xmlns:wpi="http://schemas.microsoft.com/office/word/2010/wordprocessingInk" xmlns:wne="http://schemas.microsoft.com/office/word/2006/wordml" xmlns:wps="http://schemas.microsoft.com/office/word/2010/wordprocessingShape" mc:Ignorable="w14 w15 w16se w16cid w16 w16cex w16sdtdh w16sdtfl w16du wp14">
   <w:body>
     <w:p>
       <w:pPr>
         <w:jc w:val="center"/>
-        <w:spacing w:before="0" w:after="120" w:line="276" w:lineRule="auto"/>
-      </w:pPr>
-      <w:r>
-        <w:rPr>
-          <w:rFonts w:ascii="Times New Roman" w:hAnsi="Times New Roman" w:cs="Times New Roman"/>
-          <w:sz w:val="18"/>
-          <w:b/>
-        </w:rPr>
-        <w:t xml:space="preserve">Société immobilière de gestion | Généré le 12/07/2026</w:t>
+        <w:rPr>
+          <w:rFonts w:cstheme="minorHAnsi"/>
+          <w:b/>
+          <w:bCs/>
+          <w:color w:val="000000" w:themeColor="text1"/>
+          <w:sz w:val="36"/>
+          <w:szCs w:val="36"/>
+          <w:u w:val="single"/>
+        </w:rPr>
+      </w:pPr>
+      <w:r>
+        <w:rPr>
+          <w:rFonts w:cstheme="minorHAnsi"/>
+          <w:b/>
+          <w:bCs/>
+          <w:color w:val="000000" w:themeColor="text1"/>
+          <w:sz w:val="36"/>
+          <w:szCs w:val="36"/>
+          <w:u w:val="single"/>
+        </w:rPr>
+        <w:t>CONTRAT DE BAIL A USAGE RESIDENTIEL</w:t>
+      </w:r>
+    </w:p>
+    <w:p>
+      <w:pPr>
+        <w:jc w:val="both"/>
+        <w:rPr>
+          <w:rFonts w:cstheme="minorHAnsi"/>
+          <w:color w:val="000000" w:themeColor="text1"/>
+          <w:sz w:val="24"/>
+          <w:szCs w:val="24"/>
+        </w:rPr>
+      </w:pPr>
+      <w:r>
+        <w:rPr>
+          <w:rFonts w:cstheme="minorHAnsi"/>
+          <w:color w:val="000000" w:themeColor="text1"/>
+          <w:sz w:val="24"/>
+          <w:szCs w:val="24"/>
+        </w:rPr>
+        <w:t xml:space="preserve">ENTRE : société Société immobilière de gestion, immatriculée au Registre du commerce et du Crédit Mobilier de Kinshasa sous le numéro RCCM-123 (RCCM), enregistrée à l’identification Nationale au IDN-456, dont le siège social est établi à 12 avenue de la Gombe, Kinshasa, représentée par son Gérant, Monsieur Tonton Tata. Ci-après dénommée Le Bailleur d’une part ;</w:t>
+      </w:r>
+    </w:p>
+    <w:p>
+      <w:pPr>
+        <w:jc w:val="both"/>
+        <w:rPr>
+          <w:rFonts w:cstheme="minorHAnsi"/>
+          <w:color w:val="000000" w:themeColor="text1"/>
+          <w:sz w:val="24"/>
+          <w:szCs w:val="24"/>
+        </w:rPr>
+      </w:pPr>
+      <w:r>
+        <w:rPr>
+          <w:rFonts w:cstheme="minorHAnsi"/>
+          <w:b/>
+          <w:bCs/>
+          <w:color w:val="000000" w:themeColor="text1"/>
+          <w:sz w:val="24"/>
+          <w:szCs w:val="24"/>
+        </w:rPr>
+        <w:t xml:space="preserve">Monsieur Tonton Tata, titulaire de la pièce d’identité n° A12345, domicilié à Kinshasa.</w:t>
+      </w:r>
+    </w:p>
+    <w:p>
+      <w:pPr>
+        <w:jc w:val="both"/>
+        <w:rPr>
+          <w:rFonts w:cstheme="minorHAnsi"/>
+          <w:b/>
+          <w:bCs/>
+          <w:color w:val="000000" w:themeColor="text1"/>
+          <w:sz w:val="24"/>
+          <w:szCs w:val="24"/>
+          <w:u w:val="single"/>
+        </w:rPr>
+      </w:pPr>
+      <w:r>
+        <w:rPr>
+          <w:rFonts w:cstheme="minorHAnsi"/>
+          <w:color w:val="000000" w:themeColor="text1"/>
+          <w:sz w:val="24"/>
+          <w:szCs w:val="24"/>
+          <w:highlight w:val="yellow"/>
+        </w:rPr>
+        <w:t xml:space="preserve">Titulaire de la pièce d’identité n° A12345.</w:t>
+      </w:r>
+    </w:p>
+    <w:p>
+      <w:pPr>
+        <w:jc w:val="both"/>
+        <w:rPr>
+          <w:rFonts w:cstheme="minorHAnsi"/>
+          <w:b/>
+          <w:bCs/>
+          <w:color w:val="000000" w:themeColor="text1"/>
+          <w:sz w:val="24"/>
+          <w:szCs w:val="24"/>
+          <w:u w:val="single"/>
+        </w:rPr>
+      </w:pPr>
+      <w:r>
+        <w:rPr>
+          <w:rFonts w:cstheme="minorHAnsi"/>
+          <w:b/>
+          <w:bCs/>
+          <w:color w:val="000000" w:themeColor="text1"/>
+          <w:sz w:val="24"/>
+          <w:szCs w:val="24"/>
+          <w:u w:val="single"/>
+        </w:rPr>
+        <w:t xml:space="preserve">Précisions </w:t>
       </w:r>
     </w:p>
     <w:tbl>
       <w:tblPr>
-        <w:tblW w:w="0" w:type="auto"/>
-        <w:tblLayout w:type="fixed"/>
-        <w:tblBorders>
-          <w:top w:val="single" w:sz="8" w:space="0" w:color="9aa7b1"/>
-          <w:left w:val="single" w:sz="8" w:space="0" w:color="9aa7b1"/>
-          <w:bottom w:val="single" w:sz="8" w:space="0" w:color="9aa7b1"/>
-          <w:right w:val="single" w:sz="8" w:space="0" w:color="9aa7b1"/>
-          <w:insideH w:val="single" w:sz="6" w:space="0" w:color="9aa7b1"/>
-          <w:insideV w:val="single" w:sz="6" w:space="0" w:color="9aa7b1"/>
-        </w:tblBorders>
-        <w:tblLook w:firstRow="0" w:lastRow="0" w:firstColumn="1" w:lastColumn="0" w:noHBand="0" w:noVBand="1"/>
+        <w:tblW w:w="3660" w:type="dxa"/>
+        <w:tblCellMar>
+          <w:left w:w="70" w:type="dxa"/>
+          <w:right w:w="70" w:type="dxa"/>
+        </w:tblCellMar>
+        <w:tblLook w:val="04A0" w:firstRow="1" w:lastRow="0" w:firstColumn="1" w:lastColumn="0" w:noHBand="0" w:noVBand="1"/>
       </w:tblPr>
       <w:tblGrid>
-        <w:gridCol w:w="3150"/>
-        <w:gridCol w:w="6150"/>
+        <w:gridCol w:w="3261"/>
+        <w:gridCol w:w="1299"/>
       </w:tblGrid>
       <w:tr>
+        <w:trPr>
+          <w:trHeight w:val="288"/>
+        </w:trPr>
         <w:tc>
           <w:tcPr>
-            <w:tcW w:w="3150" w:type="dxa"/>
+            <w:tcW w:w="3261" w:type="dxa"/>
+            <w:tcBorders>
+              <w:top w:val="nil"/>
+              <w:left w:val="nil"/>
+              <w:bottom w:val="nil"/>
+              <w:right w:val="nil"/>
+            </w:tcBorders>
+            <w:noWrap/>
+            <w:vAlign w:val="bottom"/>
+            <w:hideMark/>
           </w:tcPr>
           <w:p>
             <w:pPr>
-              <w:jc w:val="left"/>
-              <w:spacing w:before="0" w:after="0" w:line="276" w:lineRule="auto"/>
+              <w:spacing w:after="0" w:line="240" w:lineRule="auto"/>
+              <w:jc w:val="both"/>
+              <w:rPr>
+                <w:rFonts w:eastAsia="Times New Roman" w:cstheme="minorHAnsi"/>
+                <w:color w:val="000000" w:themeColor="text1"/>
+                <w:kern w:val="0"/>
+                <w:sz w:val="24"/>
+                <w:szCs w:val="24"/>
+                <w:lang w:eastAsia="fr-FR"/>
+                <w14:ligatures w14:val="none"/>
+              </w:rPr>
             </w:pPr>
             <w:r>
               <w:rPr>
-                <w:rFonts w:ascii="Times New Roman" w:hAnsi="Times New Roman" w:cs="Times New Roman"/>
-                <w:b/>
-                <w:sz w:val="22"/>
+                <w:rFonts w:eastAsia="Times New Roman" w:cstheme="minorHAnsi"/>
+                <w:color w:val="000000" w:themeColor="text1"/>
+                <w:kern w:val="0"/>
+                <w:sz w:val="24"/>
+                <w:szCs w:val="24"/>
+                <w:lang w:eastAsia="fr-FR"/>
+                <w14:ligatures w14:val="none"/>
               </w:rPr>
-              <w:t xml:space="preserve">Société</w:t>
+              <w:t xml:space="preserve">Appartement Non Meublé</w:t>
             </w:r>
           </w:p>
         </w:tc>
         <w:tc>
           <w:tcPr>
-            <w:tcW w:w="6150" w:type="dxa"/>
+            <w:tcW w:w="399" w:type="dxa"/>
+            <w:tcBorders>
+              <w:top w:val="nil"/>
+              <w:left w:val="nil"/>
+              <w:bottom w:val="nil"/>
+              <w:right w:val="nil"/>
+            </w:tcBorders>
+            <w:noWrap/>
+            <w:vAlign w:val="bottom"/>
+            <w:hideMark/>
           </w:tcPr>
           <w:p>
             <w:pPr>
-              <w:jc w:val="left"/>
-              <w:spacing w:before="0" w:after="0" w:line="276" w:lineRule="auto"/>
+              <w:spacing w:after="0" w:line="240" w:lineRule="auto"/>
+              <w:jc w:val="both"/>
+              <w:rPr>
+                <w:rFonts w:eastAsia="Times New Roman" w:cstheme="minorHAnsi"/>
+                <w:color w:val="000000" w:themeColor="text1"/>
+                <w:kern w:val="0"/>
+                <w:sz w:val="24"/>
+                <w:szCs w:val="24"/>
+                <w:lang w:eastAsia="fr-FR"/>
+                <w14:ligatures w14:val="none"/>
+              </w:rPr>
             </w:pPr>
             <w:r>
               <w:rPr>
-                <w:rFonts w:ascii="Times New Roman" w:hAnsi="Times New Roman" w:cs="Times New Roman"/>
-                <w:sz w:val="22"/>
+                <w:rFonts w:eastAsia="Times New Roman" w:cstheme="minorHAnsi"/>
+                <w:color w:val="000000" w:themeColor="text1"/>
+                <w:kern w:val="0"/>
+                <w:sz w:val="24"/>
+                <w:szCs w:val="24"/>
+                <w:lang w:eastAsia="fr-FR"/>
+                <w14:ligatures w14:val="none"/>
               </w:rPr>
-              <w:t xml:space="preserve">Société immobilière de gestion</w:t>
-            </w:r>
-          </w:p>
-        </w:tc>
-      </w:tr>
-      <w:tr>
-        <w:tc>
-          <w:tcPr>
-            <w:tcW w:w="3150" w:type="dxa"/>
-          </w:tcPr>
-          <w:p>
-            <w:pPr>
-              <w:jc w:val="left"/>
-              <w:spacing w:before="0" w:after="0" w:line="276" w:lineRule="auto"/>
-            </w:pPr>
-            <w:r>
-              <w:rPr>
-                <w:rFonts w:ascii="Times New Roman" w:hAnsi="Times New Roman" w:cs="Times New Roman"/>
-                <w:b/>
-                <w:sz w:val="22"/>
-              </w:rPr>
-              <w:t xml:space="preserve">RCCM</w:t>
-            </w:r>
-          </w:p>
-        </w:tc>
-        <w:tc>
-          <w:tcPr>
-            <w:tcW w:w="6150" w:type="dxa"/>
-          </w:tcPr>
-          <w:p>
-            <w:pPr>
-              <w:jc w:val="left"/>
-              <w:spacing w:before="0" w:after="0" w:line="276" w:lineRule="auto"/>
-            </w:pPr>
-            <w:r>
-              <w:rPr>
-                <w:rFonts w:ascii="Times New Roman" w:hAnsi="Times New Roman" w:cs="Times New Roman"/>
-                <w:sz w:val="22"/>
-              </w:rPr>
-              <w:t xml:space="preserve">RCCM-123</w:t>
-            </w:r>
-          </w:p>
-        </w:tc>
-      </w:tr>
-      <w:tr>
-        <w:tc>
-          <w:tcPr>
-            <w:tcW w:w="3150" w:type="dxa"/>
-          </w:tcPr>
-          <w:p>
-            <w:pPr>
-              <w:jc w:val="left"/>
-              <w:spacing w:before="0" w:after="0" w:line="276" w:lineRule="auto"/>
-            </w:pPr>
-            <w:r>
-              <w:rPr>
-                <w:rFonts w:ascii="Times New Roman" w:hAnsi="Times New Roman" w:cs="Times New Roman"/>
-                <w:b/>
-                <w:sz w:val="22"/>
-              </w:rPr>
-              <w:t xml:space="preserve">ID Nat</w:t>
-            </w:r>
-          </w:p>
-        </w:tc>
-        <w:tc>
-          <w:tcPr>
-            <w:tcW w:w="6150" w:type="dxa"/>
-          </w:tcPr>
-          <w:p>
-            <w:pPr>
-              <w:jc w:val="left"/>
-              <w:spacing w:before="0" w:after="0" w:line="276" w:lineRule="auto"/>
-            </w:pPr>
-            <w:r>
-              <w:rPr>
-                <w:rFonts w:ascii="Times New Roman" w:hAnsi="Times New Roman" w:cs="Times New Roman"/>
-                <w:sz w:val="22"/>
-              </w:rPr>
-              <w:t xml:space="preserve">IDN-456</w:t>
-            </w:r>
-          </w:p>
-        </w:tc>
-      </w:tr>
-      <w:tr>
-        <w:tc>
-          <w:tcPr>
-            <w:tcW w:w="3150" w:type="dxa"/>
-          </w:tcPr>
-          <w:p>
-            <w:pPr>
-              <w:jc w:val="left"/>
-              <w:spacing w:before="0" w:after="0" w:line="276" w:lineRule="auto"/>
-            </w:pPr>
-            <w:r>
-              <w:rPr>
-                <w:rFonts w:ascii="Times New Roman" w:hAnsi="Times New Roman" w:cs="Times New Roman"/>
-                <w:b/>
-                <w:sz w:val="22"/>
-              </w:rPr>
-              <w:t xml:space="preserve">Adresse</w:t>
-            </w:r>
-          </w:p>
-        </w:tc>
-        <w:tc>
-          <w:tcPr>
-            <w:tcW w:w="6150" w:type="dxa"/>
-          </w:tcPr>
-          <w:p>
-            <w:pPr>
-              <w:jc w:val="left"/>
-              <w:spacing w:before="0" w:after="0" w:line="276" w:lineRule="auto"/>
-            </w:pPr>
-            <w:r>
-              <w:rPr>
-                <w:rFonts w:ascii="Times New Roman" w:hAnsi="Times New Roman" w:cs="Times New Roman"/>
-                <w:sz w:val="22"/>
-              </w:rPr>
-              <w:t xml:space="preserve">12 avenue de la Gombe, Kinshasa</w:t>
-            </w:r>
-          </w:p>
-        </w:tc>
-      </w:tr>
-    </w:tbl>
-    <w:p>
-      <w:pPr>
-        <w:jc w:val="center"/>
-        <w:spacing w:before="0" w:after="220" w:line="276" w:lineRule="auto"/>
-        <w:keepNext/>
-      </w:pPr>
-      <w:r>
-        <w:rPr>
-          <w:rFonts w:ascii="Times New Roman" w:hAnsi="Times New Roman" w:cs="Times New Roman"/>
-          <w:sz w:val="32"/>
-          <w:b/>
-          <w:u w:val="single"/>
-        </w:rPr>
-        <w:t xml:space="preserve">CONTRAT DE BAIL À USAGE RÉSIDENTIEL</w:t>
-      </w:r>
-    </w:p>
-    <w:p>
-      <w:pPr>
-        <w:jc w:val="both"/>
-        <w:spacing w:before="0" w:after="0" w:line="276" w:lineRule="auto"/>
-        <w:ind w:firstLine="720"/>
-      </w:pPr>
-      <w:r>
-        <w:rPr>
-          <w:rFonts w:ascii="Times New Roman" w:hAnsi="Times New Roman" w:cs="Times New Roman"/>
-          <w:sz w:val="22"/>
-        </w:rPr>
-        <w:t xml:space="preserve">ENTRE LES SOUSSIGNÉS :</w:t>
-      </w:r>
-    </w:p>
-    <w:p>
-      <w:pPr>
-        <w:jc w:val="both"/>
-        <w:spacing w:before="0" w:after="0" w:line="276" w:lineRule="auto"/>
-      </w:pPr>
-      <w:r>
-        <w:rPr>
-          <w:rFonts w:ascii="Times New Roman" w:hAnsi="Times New Roman" w:cs="Times New Roman"/>
-          <w:sz w:val="22"/>
-        </w:rPr>
-        <w:t xml:space="preserve">Société immobilière de gestion, immatriculée au Registre du Commerce et du Crédit Mobilier sous le numéro RCCM-123, enregistrée à l’Identification Nationale sous le numéro IDN-456.</w:t>
-      </w:r>
-    </w:p>
-    <w:p>
-      <w:pPr>
-        <w:jc w:val="both"/>
-        <w:spacing w:before="160" w:after="80" w:line="276" w:lineRule="auto"/>
-      </w:pPr>
-      <w:r>
-        <w:rPr>
-          <w:rFonts w:ascii="Times New Roman" w:hAnsi="Times New Roman" w:cs="Times New Roman"/>
-          <w:sz w:val="22"/>
-          <w:b/>
-          <w:u w:val="single"/>
-        </w:rPr>
-        <w:t xml:space="preserve">ARTICLE 01 - DESCRIPTION DES LIEUX</w:t>
-      </w:r>
-    </w:p>
-    <w:p>
-      <w:pPr>
-        <w:jc w:val="both"/>
-        <w:spacing w:before="0" w:after="0" w:line="276" w:lineRule="auto"/>
-      </w:pPr>
-      <w:r>
-        <w:rPr>
-          <w:rFonts w:ascii="Times New Roman" w:hAnsi="Times New Roman" w:cs="Times New Roman"/>
-          <w:sz w:val="22"/>
-        </w:rPr>
-        <w:t xml:space="preserve">Le Bailleur donne à bail au Preneur l’appartement 1-03 situé dans l’immeuble HOPE TOWER.</w:t>
-      </w:r>
-    </w:p>
-    <w:p>
-      <w:pPr>
-        <w:jc w:val="both"/>
-        <w:spacing w:before="0" w:after="0" w:line="276" w:lineRule="auto"/>
-      </w:pPr>
-      <w:r>
-        <w:rPr>
-          <w:rFonts w:ascii="Times New Roman" w:hAnsi="Times New Roman" w:cs="Times New Roman"/>
-          <w:sz w:val="22"/>
-        </w:rPr>
-        <w:t xml:space="preserve">La société est établie en République Démocratique du Congo et agit sous la référence n° TEST-001.</w:t>
-      </w:r>
-    </w:p>
-    <w:p>
-      <w:pPr>
-        <w:jc w:val="both"/>
-        <w:spacing w:before="160" w:after="80" w:line="276" w:lineRule="auto"/>
-      </w:pPr>
-      <w:r>
-        <w:rPr>
-          <w:rFonts w:ascii="Times New Roman" w:hAnsi="Times New Roman" w:cs="Times New Roman"/>
-          <w:sz w:val="22"/>
-          <w:b/>
-          <w:u w:val="single"/>
-        </w:rPr>
-        <w:t xml:space="preserve">ARTICLE 02 - DURÉE DU BAIL ET LOYER</w:t>
-      </w:r>
-    </w:p>
-    <w:p>
-      <w:pPr>
-        <w:jc w:val="both"/>
-        <w:spacing w:before="0" w:after="0" w:line="276" w:lineRule="auto"/>
-      </w:pPr>
-      <w:r>
-        <w:rPr>
-          <w:rFonts w:ascii="Times New Roman" w:hAnsi="Times New Roman" w:cs="Times New Roman"/>
-          <w:sz w:val="22"/>
-        </w:rPr>
-        <w:t xml:space="preserve">a) Le présent contrat est conclu pour une durée de 12 mois.</w:t>
-      </w:r>
-    </w:p>
-    <w:p>
-      <w:pPr>
-        <w:jc w:val="both"/>
-        <w:spacing w:before="0" w:after="0" w:line="276" w:lineRule="auto"/>
-      </w:pPr>
-      <w:r>
-        <w:rPr>
-          <w:rFonts w:ascii="Times New Roman" w:hAnsi="Times New Roman" w:cs="Times New Roman"/>
-          <w:sz w:val="22"/>
-        </w:rPr>
-        <w:t xml:space="preserve">b) Le loyer mensuel du local est constitué de 2 150 USD le mois dont : 1 300 USD loyer, 700 USD Entretien et Maintenance, 150 USD syndic.</w:t>
-      </w:r>
-    </w:p>
-    <w:p>
-      <w:pPr>
-        <w:jc w:val="both"/>
-        <w:spacing w:before="0" w:after="0" w:line="276" w:lineRule="auto"/>
-      </w:pPr>
-      <w:r>
-        <w:rPr>
-          <w:rFonts w:ascii="Times New Roman" w:hAnsi="Times New Roman" w:cs="Times New Roman"/>
-          <w:sz w:val="22"/>
-        </w:rPr>
-        <w:t xml:space="preserve">c) La garantie locative équivaut à 3 mois (= 2 150 x 3).</w:t>
-      </w:r>
-    </w:p>
-    <w:p>
-      <w:pPr>
-        <w:jc w:val="both"/>
-        <w:spacing w:before="0" w:after="0" w:line="276" w:lineRule="auto"/>
-      </w:pPr>
-      <w:r>
-        <w:rPr>
-          <w:rFonts w:ascii="Times New Roman" w:hAnsi="Times New Roman" w:cs="Times New Roman"/>
-          <w:sz w:val="22"/>
-        </w:rPr>
-        <w:t xml:space="preserve">d) Les montants prévus peuvent être révisés par accord écrit, notamment en fonction des fluctuations économiques et des réalités du marché immobilier. Les montants en dollars équivalent au taux du jour en franc congolais.</w:t>
-      </w:r>
-    </w:p>
-    <w:p>
-      <w:pPr>
-        <w:jc w:val="both"/>
-        <w:spacing w:before="160" w:after="80" w:line="276" w:lineRule="auto"/>
-      </w:pPr>
-      <w:r>
-        <w:rPr>
-          <w:rFonts w:ascii="Times New Roman" w:hAnsi="Times New Roman" w:cs="Times New Roman"/>
-          <w:sz w:val="22"/>
-          <w:b/>
-          <w:u w:val="single"/>
-        </w:rPr>
-        <w:t xml:space="preserve">ARTICLE 03 - GARANTIE LOCATIVE ET PREMIER PAIEMENT</w:t>
-      </w:r>
-    </w:p>
-    <w:p>
-      <w:pPr>
-        <w:jc w:val="both"/>
-        <w:spacing w:before="0" w:after="0" w:line="276" w:lineRule="auto"/>
-      </w:pPr>
-      <w:r>
-        <w:rPr>
-          <w:rFonts w:ascii="Times New Roman" w:hAnsi="Times New Roman" w:cs="Times New Roman"/>
-          <w:sz w:val="22"/>
-        </w:rPr>
-        <w:t xml:space="preserve">Le Preneur verse la garantie locative conformément au présent contrat.</w:t>
-      </w:r>
-    </w:p>
-    <w:p>
-      <w:pPr>
-        <w:jc w:val="both"/>
-        <w:spacing w:before="0" w:after="0" w:line="276" w:lineRule="auto"/>
-      </w:pPr>
-      <w:r>
-        <w:rPr>
-          <w:rFonts w:ascii="Times New Roman" w:hAnsi="Times New Roman" w:cs="Times New Roman"/>
-          <w:sz w:val="22"/>
-        </w:rPr>
-        <w:t xml:space="preserve">Fait à Kinshasa, le 12/07/2026.</w:t>
-      </w:r>
-    </w:p>
-    <w:tbl>
-      <w:tblPr>
-        <w:tblW w:w="0" w:type="auto"/>
-        <w:tblLayout w:type="fixed"/>
-        <w:tblBorders>
-          <w:top w:val="single" w:sz="8" w:space="0" w:color="9aa7b1"/>
-          <w:left w:val="single" w:sz="8" w:space="0" w:color="9aa7b1"/>
-          <w:bottom w:val="single" w:sz="8" w:space="0" w:color="9aa7b1"/>
-          <w:right w:val="single" w:sz="8" w:space="0" w:color="9aa7b1"/>
-          <w:insideH w:val="single" w:sz="6" w:space="0" w:color="9aa7b1"/>
-          <w:insideV w:val="single" w:sz="6" w:space="0" w:color="9aa7b1"/>
-        </w:tblBorders>
-        <w:tblLook w:firstRow="1" w:lastRow="0" w:firstColumn="1" w:lastColumn="0" w:noHBand="1" w:noVBand="1"/>
-      </w:tblPr>
-      <w:tblGrid>
-        <w:gridCol w:w="4500"/>
-        <w:gridCol w:w="4500"/>
-      </w:tblGrid>
-      <w:tr>
-        <w:trPr>
-          <w:trHeight w:val="380" w:hRule="atLeast"/>
-        </w:trPr>
-        <w:tc>
-          <w:tcPr>
-            <w:tcW w:w="4500" w:type="dxa"/>
-          </w:tcPr>
-          <w:p>
-            <w:pPr>
-              <w:jc w:val="center"/>
-              <w:spacing w:before="0" w:after="80" w:line="276" w:lineRule="auto"/>
-            </w:pPr>
-            <w:r>
-              <w:rPr>
-                <w:rFonts w:ascii="Times New Roman" w:hAnsi="Times New Roman" w:cs="Times New Roman"/>
-                <w:b/>
-                <w:sz w:val="22"/>
-              </w:rPr>
-              <w:t xml:space="preserve">LE PRENEUR</w:t>
-            </w:r>
-          </w:p>
-        </w:tc>
-        <w:tc>
-          <w:tcPr>
-            <w:tcW w:w="4500" w:type="dxa"/>
-          </w:tcPr>
-          <w:p>
-            <w:pPr>
-              <w:jc w:val="center"/>
-              <w:spacing w:before="0" w:after="80" w:line="276" w:lineRule="auto"/>
-            </w:pPr>
-            <w:r>
-              <w:rPr>
-                <w:rFonts w:ascii="Times New Roman" w:hAnsi="Times New Roman" w:cs="Times New Roman"/>
-                <w:b/>
-                <w:sz w:val="22"/>
-              </w:rPr>
-              <w:t xml:space="preserve">LE BAILLEUR</w:t>
+              <w:t xml:space="preserve">1-03</w:t>
             </w:r>
           </w:p>
         </w:tc>
       </w:tr>
       <w:tr>
         <w:trPr>
-          <w:trHeight w:val="1800" w:hRule="atLeast"/>
+          <w:trHeight w:val="288"/>
         </w:trPr>
         <w:tc>
           <w:tcPr>
-            <w:tcW w:w="4500" w:type="dxa"/>
+            <w:tcW w:w="3261" w:type="dxa"/>
+            <w:tcBorders>
+              <w:top w:val="nil"/>
+              <w:left w:val="nil"/>
+              <w:bottom w:val="nil"/>
+              <w:right w:val="nil"/>
+            </w:tcBorders>
+            <w:noWrap/>
+            <w:vAlign w:val="bottom"/>
+            <w:hideMark/>
           </w:tcPr>
           <w:p>
             <w:pPr>
-              <w:jc w:val="left"/>
-              <w:spacing w:before="0" w:after="120" w:line="276" w:lineRule="auto"/>
+              <w:spacing w:after="0" w:line="240" w:lineRule="auto"/>
+              <w:jc w:val="both"/>
+              <w:rPr>
+                <w:rFonts w:eastAsia="Times New Roman" w:cstheme="minorHAnsi"/>
+                <w:color w:val="000000" w:themeColor="text1"/>
+                <w:kern w:val="0"/>
+                <w:sz w:val="24"/>
+                <w:szCs w:val="24"/>
+                <w:lang w:eastAsia="fr-FR"/>
+                <w14:ligatures w14:val="none"/>
+              </w:rPr>
             </w:pPr>
             <w:r>
               <w:rPr>
-                <w:rFonts w:ascii="Times New Roman" w:hAnsi="Times New Roman" w:cs="Times New Roman"/>
-                <w:sz w:val="22"/>
+                <w:rFonts w:eastAsia="Times New Roman" w:cstheme="minorHAnsi"/>
+                <w:color w:val="000000" w:themeColor="text1"/>
+                <w:kern w:val="0"/>
+                <w:sz w:val="24"/>
+                <w:szCs w:val="24"/>
+                <w:lang w:eastAsia="fr-FR"/>
+                <w14:ligatures w14:val="none"/>
               </w:rPr>
-              <w:t xml:space="preserve"> </w:t>
+              <w:t>Nombre de Chambre</w:t>
             </w:r>
           </w:p>
         </w:tc>
         <w:tc>
           <w:tcPr>
-            <w:tcW w:w="4500" w:type="dxa"/>
+            <w:tcW w:w="399" w:type="dxa"/>
+            <w:tcBorders>
+              <w:top w:val="nil"/>
+              <w:left w:val="nil"/>
+              <w:bottom w:val="nil"/>
+              <w:right w:val="nil"/>
+            </w:tcBorders>
+            <w:noWrap/>
+            <w:vAlign w:val="bottom"/>
+            <w:hideMark/>
           </w:tcPr>
           <w:p>
             <w:pPr>
-              <w:jc w:val="left"/>
-              <w:spacing w:before="0" w:after="120" w:line="276" w:lineRule="auto"/>
+              <w:spacing w:after="0" w:line="240" w:lineRule="auto"/>
+              <w:jc w:val="both"/>
+              <w:rPr>
+                <w:rFonts w:eastAsia="Times New Roman" w:cstheme="minorHAnsi"/>
+                <w:color w:val="000000" w:themeColor="text1"/>
+                <w:kern w:val="0"/>
+                <w:sz w:val="24"/>
+                <w:szCs w:val="24"/>
+                <w:lang w:eastAsia="fr-FR"/>
+                <w14:ligatures w14:val="none"/>
+              </w:rPr>
             </w:pPr>
             <w:r>
               <w:rPr>
-                <w:rFonts w:ascii="Times New Roman" w:hAnsi="Times New Roman" w:cs="Times New Roman"/>
-                <w:sz w:val="22"/>
+                <w:rFonts w:eastAsia="Times New Roman" w:cstheme="minorHAnsi"/>
+                <w:color w:val="000000" w:themeColor="text1"/>
+                <w:kern w:val="0"/>
+                <w:sz w:val="24"/>
+                <w:szCs w:val="24"/>
+                <w:lang w:eastAsia="fr-FR"/>
+                <w14:ligatures w14:val="none"/>
               </w:rPr>
-              <w:t xml:space="preserve"> </w:t>
+              <w:t xml:space="preserve">2</w:t>
+            </w:r>
+          </w:p>
+        </w:tc>
+      </w:tr>
+      <w:tr>
+        <w:trPr>
+          <w:trHeight w:val="288"/>
+        </w:trPr>
+        <w:tc>
+          <w:tcPr>
+            <w:tcW w:w="3261" w:type="dxa"/>
+            <w:tcBorders>
+              <w:top w:val="nil"/>
+              <w:left w:val="nil"/>
+              <w:bottom w:val="nil"/>
+              <w:right w:val="nil"/>
+            </w:tcBorders>
+            <w:noWrap/>
+            <w:vAlign w:val="bottom"/>
+            <w:hideMark/>
+          </w:tcPr>
+          <w:p>
+            <w:pPr>
+              <w:spacing w:after="0" w:line="240" w:lineRule="auto"/>
+              <w:jc w:val="both"/>
+              <w:rPr>
+                <w:rFonts w:eastAsia="Times New Roman" w:cstheme="minorHAnsi"/>
+                <w:color w:val="000000" w:themeColor="text1"/>
+                <w:kern w:val="0"/>
+                <w:sz w:val="24"/>
+                <w:szCs w:val="24"/>
+                <w:lang w:eastAsia="fr-FR"/>
+                <w14:ligatures w14:val="none"/>
+              </w:rPr>
+            </w:pPr>
+            <w:r>
+              <w:rPr>
+                <w:rFonts w:eastAsia="Times New Roman" w:cstheme="minorHAnsi"/>
+                <w:color w:val="000000" w:themeColor="text1"/>
+                <w:kern w:val="0"/>
+                <w:sz w:val="24"/>
+                <w:szCs w:val="24"/>
+                <w:lang w:eastAsia="fr-FR"/>
+                <w14:ligatures w14:val="none"/>
+              </w:rPr>
+              <w:t xml:space="preserve">Nombre de Parking </w:t>
+            </w:r>
+          </w:p>
+        </w:tc>
+        <w:tc>
+          <w:tcPr>
+            <w:tcW w:w="399" w:type="dxa"/>
+            <w:tcBorders>
+              <w:top w:val="nil"/>
+              <w:left w:val="nil"/>
+              <w:bottom w:val="nil"/>
+              <w:right w:val="nil"/>
+            </w:tcBorders>
+            <w:noWrap/>
+            <w:vAlign w:val="bottom"/>
+            <w:hideMark/>
+          </w:tcPr>
+          <w:p>
+            <w:pPr>
+              <w:spacing w:after="0" w:line="240" w:lineRule="auto"/>
+              <w:jc w:val="both"/>
+              <w:rPr>
+                <w:rFonts w:eastAsia="Times New Roman" w:cstheme="minorHAnsi"/>
+                <w:color w:val="000000" w:themeColor="text1"/>
+                <w:kern w:val="0"/>
+                <w:sz w:val="24"/>
+                <w:szCs w:val="24"/>
+                <w:lang w:eastAsia="fr-FR"/>
+                <w14:ligatures w14:val="none"/>
+              </w:rPr>
+            </w:pPr>
+            <w:r>
+              <w:rPr>
+                <w:rFonts w:eastAsia="Times New Roman" w:cstheme="minorHAnsi"/>
+                <w:color w:val="000000" w:themeColor="text1"/>
+                <w:kern w:val="0"/>
+                <w:sz w:val="24"/>
+                <w:szCs w:val="24"/>
+                <w:lang w:eastAsia="fr-FR"/>
+                <w14:ligatures w14:val="none"/>
+              </w:rPr>
+              <w:t xml:space="preserve">1</w:t>
+            </w:r>
+          </w:p>
+        </w:tc>
+      </w:tr>
+      <w:tr>
+        <w:trPr>
+          <w:trHeight w:val="288"/>
+        </w:trPr>
+        <w:tc>
+          <w:tcPr>
+            <w:tcW w:w="3261" w:type="dxa"/>
+            <w:tcBorders>
+              <w:top w:val="nil"/>
+              <w:left w:val="nil"/>
+              <w:bottom w:val="nil"/>
+              <w:right w:val="nil"/>
+            </w:tcBorders>
+            <w:noWrap/>
+            <w:vAlign w:val="bottom"/>
+            <w:hideMark/>
+          </w:tcPr>
+          <w:p>
+            <w:pPr>
+              <w:spacing w:after="0" w:line="240" w:lineRule="auto"/>
+              <w:jc w:val="both"/>
+              <w:rPr>
+                <w:rFonts w:eastAsia="Times New Roman" w:cstheme="minorHAnsi"/>
+                <w:color w:val="000000" w:themeColor="text1"/>
+                <w:kern w:val="0"/>
+                <w:sz w:val="24"/>
+                <w:szCs w:val="24"/>
+                <w:lang w:eastAsia="fr-FR"/>
+                <w14:ligatures w14:val="none"/>
+              </w:rPr>
+            </w:pPr>
+            <w:r>
+              <w:rPr>
+                <w:rFonts w:eastAsia="Times New Roman" w:cstheme="minorHAnsi"/>
+                <w:color w:val="000000" w:themeColor="text1"/>
+                <w:kern w:val="0"/>
+                <w:sz w:val="24"/>
+                <w:szCs w:val="24"/>
+                <w:lang w:eastAsia="fr-FR"/>
+                <w14:ligatures w14:val="none"/>
+              </w:rPr>
+              <w:t>Date de Début de Contrat</w:t>
+            </w:r>
+          </w:p>
+        </w:tc>
+        <w:tc>
+          <w:tcPr>
+            <w:tcW w:w="399" w:type="dxa"/>
+            <w:tcBorders>
+              <w:top w:val="nil"/>
+              <w:left w:val="nil"/>
+              <w:bottom w:val="nil"/>
+              <w:right w:val="nil"/>
+            </w:tcBorders>
+            <w:noWrap/>
+            <w:vAlign w:val="bottom"/>
+            <w:hideMark/>
+          </w:tcPr>
+          <w:p>
+            <w:pPr>
+              <w:spacing w:after="0" w:line="240" w:lineRule="auto"/>
+              <w:jc w:val="both"/>
+              <w:rPr>
+                <w:rFonts w:eastAsia="Times New Roman" w:cstheme="minorHAnsi"/>
+                <w:color w:val="000000" w:themeColor="text1"/>
+                <w:kern w:val="0"/>
+                <w:sz w:val="24"/>
+                <w:szCs w:val="24"/>
+                <w:lang w:eastAsia="fr-FR"/>
+                <w14:ligatures w14:val="none"/>
+              </w:rPr>
+            </w:pPr>
+            <w:r>
+              <w:rPr>
+                <w:rFonts w:eastAsia="Times New Roman" w:cstheme="minorHAnsi"/>
+                <w:color w:val="000000" w:themeColor="text1"/>
+                <w:kern w:val="0"/>
+                <w:sz w:val="24"/>
+                <w:szCs w:val="24"/>
+                <w:lang w:eastAsia="fr-FR"/>
+                <w14:ligatures w14:val="none"/>
+              </w:rPr>
+              <w:t xml:space="preserve">12/07/2026</w:t>
             </w:r>
           </w:p>
         </w:tc>
       </w:tr>
     </w:tbl>
+    <w:p>
+      <w:pPr>
+        <w:jc w:val="both"/>
+        <w:rPr>
+          <w:rFonts w:cstheme="minorHAnsi"/>
+          <w:b/>
+          <w:bCs/>
+          <w:color w:val="000000" w:themeColor="text1"/>
+          <w:sz w:val="24"/>
+          <w:szCs w:val="24"/>
+          <w:u w:val="single"/>
+        </w:rPr>
+      </w:pPr>
+    </w:p>
+    <w:p>
+      <w:pPr>
+        <w:jc w:val="both"/>
+        <w:rPr>
+          <w:rFonts w:cstheme="minorHAnsi"/>
+          <w:b/>
+          <w:bCs/>
+          <w:color w:val="000000" w:themeColor="text1"/>
+          <w:sz w:val="24"/>
+          <w:szCs w:val="24"/>
+        </w:rPr>
+      </w:pPr>
+      <w:r>
+        <w:rPr>
+          <w:rFonts w:cstheme="minorHAnsi"/>
+          <w:b/>
+          <w:bCs/>
+          <w:color w:val="000000" w:themeColor="text1"/>
+          <w:sz w:val="24"/>
+          <w:szCs w:val="24"/>
+        </w:rPr>
+        <w:t>Article</w:t>
+      </w:r>
+      <w:r>
+        <w:rPr>
+          <w:rFonts w:cstheme="minorHAnsi"/>
+          <w:b/>
+          <w:bCs/>
+          <w:color w:val="000000" w:themeColor="text1"/>
+          <w:sz w:val="24"/>
+          <w:szCs w:val="24"/>
+        </w:rPr>
+        <w:t xml:space="preserve"> 01 : </w:t>
+      </w:r>
+      <w:r>
+        <w:rPr>
+          <w:rFonts w:cstheme="minorHAnsi"/>
+          <w:b/>
+          <w:bCs/>
+          <w:color w:val="000000" w:themeColor="text1"/>
+          <w:sz w:val="24"/>
+          <w:szCs w:val="24"/>
+          <w:u w:val="single"/>
+        </w:rPr>
+        <w:t>DE LA DESC</w:t>
+      </w:r>
+      <w:r>
+        <w:rPr>
+          <w:rFonts w:cstheme="minorHAnsi"/>
+          <w:b/>
+          <w:bCs/>
+          <w:color w:val="000000" w:themeColor="text1"/>
+          <w:sz w:val="24"/>
+          <w:szCs w:val="24"/>
+          <w:u w:val="single"/>
+        </w:rPr>
+        <w:t>R</w:t>
+      </w:r>
+      <w:r>
+        <w:rPr>
+          <w:rFonts w:cstheme="minorHAnsi"/>
+          <w:b/>
+          <w:bCs/>
+          <w:color w:val="000000" w:themeColor="text1"/>
+          <w:sz w:val="24"/>
+          <w:szCs w:val="24"/>
+          <w:u w:val="single"/>
+        </w:rPr>
+        <w:t>IPTION DU LIEU</w:t>
+      </w:r>
+      <w:r>
+        <w:rPr>
+          <w:rFonts w:cstheme="minorHAnsi"/>
+          <w:b/>
+          <w:bCs/>
+          <w:color w:val="000000" w:themeColor="text1"/>
+          <w:sz w:val="24"/>
+          <w:szCs w:val="24"/>
+        </w:rPr>
+        <w:t xml:space="preserve"> </w:t>
+      </w:r>
+    </w:p>
+    <w:p>
+      <w:pPr>
+        <w:jc w:val="both"/>
+        <w:rPr>
+          <w:rFonts w:cstheme="minorHAnsi"/>
+          <w:color w:val="000000" w:themeColor="text1"/>
+          <w:sz w:val="24"/>
+          <w:szCs w:val="24"/>
+        </w:rPr>
+      </w:pPr>
+      <w:r>
+        <w:rPr>
+          <w:rFonts w:cstheme="minorHAnsi"/>
+          <w:color w:val="000000" w:themeColor="text1"/>
+          <w:sz w:val="24"/>
+          <w:szCs w:val="24"/>
+        </w:rPr>
+        <w:t xml:space="preserve">Le Bailleur donne à bail au preneur qui accepte la location d’un appartement N1-03 Immeuble HOPE TOWER situé sur Avenue du Port. Gombe, Centre-ville, dans la Ville de Kinshasa, République Démocratique du Congo. Le Preneur connaît avoir visité les biens loués qu’il connaît parfaitement sans qu’il soit nécessaire d’en faire de plus amples descriptions.</w:t>
+      </w:r>
+    </w:p>
+    <w:p>
+      <w:pPr>
+        <w:jc w:val="both"/>
+        <w:rPr>
+          <w:rFonts w:cstheme="minorHAnsi"/>
+          <w:color w:val="000000" w:themeColor="text1"/>
+          <w:sz w:val="24"/>
+          <w:szCs w:val="24"/>
+        </w:rPr>
+      </w:pPr>
+      <w:r>
+        <w:rPr>
+          <w:rFonts w:cstheme="minorHAnsi"/>
+          <w:color w:val="000000" w:themeColor="text1"/>
+          <w:sz w:val="24"/>
+          <w:szCs w:val="24"/>
+        </w:rPr>
+        <w:t>Toutefois, un état des lieux contradictoire avec ou sans témoin sera dressé avant la remise des clés au preneur. Les biens loués sont destinés à l</w:t>
+      </w:r>
+      <w:r>
+        <w:rPr>
+          <w:rFonts w:cstheme="minorHAnsi"/>
+          <w:color w:val="000000" w:themeColor="text1"/>
+          <w:sz w:val="24"/>
+          <w:szCs w:val="24"/>
+        </w:rPr>
+        <w:t>’</w:t>
+      </w:r>
+      <w:r>
+        <w:rPr>
+          <w:rFonts w:cstheme="minorHAnsi"/>
+          <w:color w:val="000000" w:themeColor="text1"/>
+          <w:sz w:val="24"/>
+          <w:szCs w:val="24"/>
+        </w:rPr>
+        <w:t>usage résidentiel.</w:t>
+      </w:r>
+    </w:p>
+    <w:p>
+      <w:pPr>
+        <w:jc w:val="both"/>
+        <w:rPr>
+          <w:rFonts w:cstheme="minorHAnsi"/>
+          <w:color w:val="000000" w:themeColor="text1"/>
+          <w:sz w:val="24"/>
+          <w:szCs w:val="24"/>
+        </w:rPr>
+      </w:pPr>
+    </w:p>
+    <w:p>
+      <w:pPr>
+        <w:jc w:val="both"/>
+        <w:rPr>
+          <w:rFonts w:cstheme="minorHAnsi"/>
+          <w:b/>
+          <w:bCs/>
+          <w:color w:val="000000" w:themeColor="text1"/>
+          <w:sz w:val="24"/>
+          <w:szCs w:val="24"/>
+        </w:rPr>
+      </w:pPr>
+      <w:r>
+        <w:rPr>
+          <w:rFonts w:cstheme="minorHAnsi"/>
+          <w:b/>
+          <w:bCs/>
+          <w:color w:val="000000" w:themeColor="text1"/>
+          <w:sz w:val="24"/>
+          <w:szCs w:val="24"/>
+        </w:rPr>
+        <w:t xml:space="preserve">Article 02 : </w:t>
+      </w:r>
+      <w:r>
+        <w:rPr>
+          <w:rFonts w:cstheme="minorHAnsi"/>
+          <w:b/>
+          <w:bCs/>
+          <w:color w:val="000000" w:themeColor="text1"/>
+          <w:sz w:val="24"/>
+          <w:szCs w:val="24"/>
+          <w:u w:val="single"/>
+        </w:rPr>
+        <w:t>DE LA DUREE DU BAIL ET DU LOYER</w:t>
+      </w:r>
+    </w:p>
+    <w:p>
+      <w:pPr>
+        <w:pStyle w:val="Paragraphedeliste"/>
+        <w:numPr>
+          <w:ilvl w:val="0"/>
+          <w:numId w:val="1"/>
+        </w:numPr>
+        <w:jc w:val="both"/>
+        <w:rPr>
+          <w:rFonts w:cstheme="minorHAnsi"/>
+          <w:color w:val="000000" w:themeColor="text1"/>
+          <w:sz w:val="24"/>
+          <w:szCs w:val="24"/>
+        </w:rPr>
+      </w:pPr>
+      <w:r>
+        <w:rPr>
+          <w:rFonts w:cstheme="minorHAnsi"/>
+          <w:color w:val="000000" w:themeColor="text1"/>
+          <w:sz w:val="24"/>
+          <w:szCs w:val="24"/>
+        </w:rPr>
+        <w:t xml:space="preserve">S’agissant de la durée, le présent contrat de bail est conclus pour une durée de 12 mois et entre en vigueur à la date de sa signature. Il est renouvelable avec l’accord du bailleur par écrit. Chacune des deux parties peut y mettre fin moyennant un préavis de 3 mois ou par convention mutuelle. Dans ce cas, la partie qui prend l’initiative de mettre fin au contrat devra notifier à l’autre son intention écrite, transmise par la lettre recommandée ou par lettre avec accusé de réceptions sous peine d’indemnités pour rupture abusive.</w:t>
+      </w:r>
+    </w:p>
+    <w:p>
+      <w:pPr>
+        <w:jc w:val="both"/>
+        <w:rPr>
+          <w:rFonts w:cstheme="minorHAnsi"/>
+          <w:color w:val="000000" w:themeColor="text1"/>
+          <w:sz w:val="24"/>
+          <w:szCs w:val="24"/>
+        </w:rPr>
+      </w:pPr>
+    </w:p>
+    <w:p>
+      <w:pPr>
+        <w:jc w:val="both"/>
+        <w:rPr>
+          <w:rFonts w:cstheme="minorHAnsi"/>
+          <w:color w:val="000000" w:themeColor="text1"/>
+          <w:sz w:val="24"/>
+          <w:szCs w:val="24"/>
+        </w:rPr>
+      </w:pPr>
+    </w:p>
+    <w:p>
+      <w:pPr>
+        <w:pStyle w:val="Corpsdetexte"/>
+        <w:jc w:val="both"/>
+        <w:rPr>
+          <w:rFonts w:asciiTheme="minorHAnsi" w:hAnsiTheme="minorHAnsi" w:cstheme="minorHAnsi"/>
+          <w:b/>
+          <w:color w:val="000000" w:themeColor="text1"/>
+        </w:rPr>
+      </w:pPr>
+    </w:p>
+    <w:p>
+      <w:pPr>
+        <w:pStyle w:val="Corpsdetexte"/>
+        <w:numPr>
+          <w:ilvl w:val="0"/>
+          <w:numId w:val="1"/>
+        </w:numPr>
+        <w:ind w:right="261"/>
+        <w:jc w:val="both"/>
+        <w:rPr>
+          <w:rFonts w:ascii="Calibri" w:hAnsi="Calibri" w:cs="Calibri"/>
+          <w:color w:val="000000" w:themeColor="text1"/>
+          <w:spacing w:val="-6"/>
+          <w:w w:val="105"/>
+        </w:rPr>
+      </w:pPr>
+      <w:r>
+        <w:rPr>
+          <w:rFonts w:ascii="Calibri" w:hAnsi="Calibri" w:cs="Calibri"/>
+          <w:color w:val="000000" w:themeColor="text1"/>
+          <w:w w:val="105"/>
+        </w:rPr>
+        <w:t xml:space="preserve">Le loyer mensuel du local est constitué de 2 150 USD le mois dont :</w:t>
+      </w:r>
+      <w:r>
+        <w:br/>
+      </w:r>
+      <w:r>
+        <w:rPr>
+          <w:rFonts w:ascii="Calibri" w:hAnsi="Calibri" w:cs="Calibri"/>
+          <w:color w:val="000000" w:themeColor="text1"/>
+          <w:w w:val="105"/>
+        </w:rPr>
+        <w:t xml:space="preserve">1 300 USD loyer</w:t>
+      </w:r>
+      <w:r>
+        <w:br/>
+      </w:r>
+      <w:r>
+        <w:rPr>
+          <w:rFonts w:ascii="Calibri" w:hAnsi="Calibri" w:cs="Calibri"/>
+          <w:color w:val="000000" w:themeColor="text1"/>
+          <w:w w:val="105"/>
+        </w:rPr>
+        <w:t xml:space="preserve">700 USD Entretien et Maintenance</w:t>
+      </w:r>
+      <w:r>
+        <w:br/>
+      </w:r>
+      <w:r>
+        <w:rPr>
+          <w:rFonts w:ascii="Calibri" w:hAnsi="Calibri" w:cs="Calibri"/>
+          <w:color w:val="000000" w:themeColor="text1"/>
+          <w:w w:val="105"/>
+        </w:rPr>
+        <w:t xml:space="preserve">150 USD syndic</w:t>
+      </w:r>
+    </w:p>
+    <w:p>
+      <w:pPr>
+        <w:pStyle w:val="Paragraphedeliste"/>
+        <w:jc w:val="both"/>
+        <w:rPr>
+          <w:rFonts w:ascii="Calibri" w:hAnsi="Calibri" w:cs="Calibri"/>
+          <w:color w:val="000000" w:themeColor="text1"/>
+        </w:rPr>
+      </w:pPr>
+    </w:p>
+    <w:p>
+      <w:pPr>
+        <w:pStyle w:val="Corpsdetexte"/>
+        <w:jc w:val="both"/>
+        <w:rPr>
+          <w:rFonts w:asciiTheme="minorHAnsi" w:hAnsiTheme="minorHAnsi" w:cstheme="minorHAnsi"/>
+          <w:color w:val="EE0000"/>
+          <w:u w:val="single"/>
+        </w:rPr>
+      </w:pPr>
+    </w:p>
+    <w:p>
+      <w:pPr>
+        <w:jc w:val="both"/>
+        <w:rPr>
+          <w:rFonts w:cstheme="minorHAnsi"/>
+          <w:sz w:val="24"/>
+          <w:szCs w:val="24"/>
+        </w:rPr>
+      </w:pPr>
+    </w:p>
+    <w:p>
+      <w:pPr>
+        <w:pStyle w:val="Paragraphedeliste"/>
+        <w:numPr>
+          <w:ilvl w:val="0"/>
+          <w:numId w:val="1"/>
+        </w:numPr>
+        <w:jc w:val="both"/>
+        <w:rPr>
+          <w:rFonts w:cstheme="minorHAnsi"/>
+          <w:color w:val="000000" w:themeColor="text1"/>
+          <w:sz w:val="24"/>
+          <w:szCs w:val="24"/>
+        </w:rPr>
+      </w:pPr>
+      <w:r>
+        <w:rPr>
+          <w:rFonts w:cstheme="minorHAnsi"/>
+          <w:color w:val="000000" w:themeColor="text1"/>
+          <w:sz w:val="24"/>
+          <w:szCs w:val="24"/>
+        </w:rPr>
+        <w:t xml:space="preserve">Le loyer ainsi convenu comprend l’entretien des parties communes, les factures d’eau et d’électricité, les caméras de surveillance et tout autre espace en commun à l’exclusion des services d’entretien des climatiseurs ou de réparation </w:t>
+      </w:r>
+      <w:r>
+        <w:rPr>
+          <w:rFonts w:cstheme="minorHAnsi"/>
+          <w:color w:val="000000" w:themeColor="text1"/>
+          <w:sz w:val="24"/>
+          <w:szCs w:val="24"/>
+        </w:rPr>
+        <w:t>de tout autre accessoire.</w:t>
+      </w:r>
+    </w:p>
+    <w:p>
+      <w:pPr>
+        <w:pStyle w:val="Paragraphedeliste"/>
+        <w:numPr>
+          <w:ilvl w:val="0"/>
+          <w:numId w:val="1"/>
+        </w:numPr>
+        <w:jc w:val="both"/>
+        <w:rPr>
+          <w:rFonts w:cstheme="minorHAnsi"/>
+          <w:color w:val="000000" w:themeColor="text1"/>
+          <w:sz w:val="24"/>
+          <w:szCs w:val="24"/>
+        </w:rPr>
+      </w:pPr>
+      <w:r>
+        <w:rPr>
+          <w:rFonts w:cstheme="minorHAnsi"/>
+          <w:color w:val="000000" w:themeColor="text1"/>
+          <w:sz w:val="24"/>
+          <w:szCs w:val="24"/>
+        </w:rPr>
+        <w:t xml:space="preserve">Les parties conviennent que le loyer pourra être revu par </w:t>
+      </w:r>
+      <w:r>
+        <w:rPr>
+          <w:rFonts w:cstheme="minorHAnsi"/>
+          <w:color w:val="000000" w:themeColor="text1"/>
+          <w:sz w:val="24"/>
+          <w:szCs w:val="24"/>
+        </w:rPr>
+        <w:t>la Direction d</w:t>
+      </w:r>
+      <w:r>
+        <w:rPr>
+          <w:rFonts w:cstheme="minorHAnsi"/>
+          <w:color w:val="000000" w:themeColor="text1"/>
+          <w:sz w:val="24"/>
+          <w:szCs w:val="24"/>
+        </w:rPr>
+        <w:t>u bailleur</w:t>
+      </w:r>
+      <w:r>
+        <w:rPr>
+          <w:rFonts w:cstheme="minorHAnsi"/>
+          <w:color w:val="000000" w:themeColor="text1"/>
+          <w:sz w:val="24"/>
+          <w:szCs w:val="24"/>
+        </w:rPr>
+        <w:t xml:space="preserve"> eu égard aux fluctuations économique liées aux réalités du marché immobilier.</w:t>
+      </w:r>
+      <w:r>
+        <w:rPr>
+          <w:rFonts w:cstheme="minorHAnsi"/>
+          <w:color w:val="000000" w:themeColor="text1"/>
+          <w:sz w:val="24"/>
+          <w:szCs w:val="24"/>
+        </w:rPr>
+        <w:t xml:space="preserve"> </w:t>
+      </w:r>
+    </w:p>
+    <w:p>
+      <w:pPr>
+        <w:jc w:val="both"/>
+        <w:rPr>
+          <w:rFonts w:cstheme="minorHAnsi"/>
+          <w:color w:val="000000" w:themeColor="text1"/>
+          <w:sz w:val="24"/>
+          <w:szCs w:val="24"/>
+        </w:rPr>
+      </w:pPr>
+    </w:p>
+    <w:p>
+      <w:pPr>
+        <w:jc w:val="both"/>
+        <w:rPr>
+          <w:rFonts w:cstheme="minorHAnsi"/>
+          <w:b/>
+          <w:bCs/>
+          <w:color w:val="000000" w:themeColor="text1"/>
+          <w:sz w:val="24"/>
+          <w:szCs w:val="24"/>
+          <w:u w:val="single"/>
+        </w:rPr>
+      </w:pPr>
+      <w:r>
+        <w:rPr>
+          <w:rFonts w:cstheme="minorHAnsi"/>
+          <w:b/>
+          <w:bCs/>
+          <w:color w:val="000000" w:themeColor="text1"/>
+          <w:sz w:val="24"/>
+          <w:szCs w:val="24"/>
+        </w:rPr>
+        <w:t xml:space="preserve">Article 03 : </w:t>
+      </w:r>
+      <w:r>
+        <w:rPr>
+          <w:rFonts w:cstheme="minorHAnsi"/>
+          <w:b/>
+          <w:bCs/>
+          <w:color w:val="000000" w:themeColor="text1"/>
+          <w:sz w:val="24"/>
+          <w:szCs w:val="24"/>
+          <w:u w:val="single"/>
+        </w:rPr>
+        <w:t>DE LA GARANTIE LOCATIVE ET PREMIER PAIEMEN</w:t>
+      </w:r>
+      <w:r>
+        <w:rPr>
+          <w:rFonts w:cstheme="minorHAnsi"/>
+          <w:b/>
+          <w:bCs/>
+          <w:color w:val="000000" w:themeColor="text1"/>
+          <w:sz w:val="24"/>
+          <w:szCs w:val="24"/>
+          <w:u w:val="single"/>
+        </w:rPr>
+        <w:t>T</w:t>
+      </w:r>
+    </w:p>
+    <w:p>
+      <w:pPr>
+        <w:jc w:val="both"/>
+        <w:rPr>
+          <w:rFonts w:cstheme="minorHAnsi"/>
+          <w:b/>
+          <w:bCs/>
+          <w:color w:val="000000" w:themeColor="text1"/>
+          <w:sz w:val="24"/>
+          <w:szCs w:val="24"/>
+          <w:u w:val="single"/>
+        </w:rPr>
+      </w:pPr>
+    </w:p>
+    <w:p>
+      <w:pPr>
+        <w:pStyle w:val="Paragraphedeliste"/>
+        <w:numPr>
+          <w:ilvl w:val="0"/>
+          <w:numId w:val="9"/>
+        </w:numPr>
+        <w:jc w:val="both"/>
+        <w:rPr>
+          <w:rFonts w:cstheme="minorHAnsi"/>
+          <w:b/>
+          <w:bCs/>
+          <w:color w:val="000000" w:themeColor="text1"/>
+          <w:sz w:val="24"/>
+          <w:szCs w:val="24"/>
+        </w:rPr>
+      </w:pPr>
+      <w:r>
+        <w:rPr>
+          <w:rFonts w:cstheme="minorHAnsi"/>
+          <w:color w:val="000000" w:themeColor="text1"/>
+          <w:sz w:val="24"/>
+          <w:szCs w:val="24"/>
+        </w:rPr>
+        <w:t xml:space="preserve">La garantie locative équivaut à 3 mois (= 2 150 x 3)</w:t>
+      </w:r>
+    </w:p>
+    <w:p>
+      <w:pPr>
+        <w:pStyle w:val="Paragraphedeliste"/>
+        <w:numPr>
+          <w:ilvl w:val="0"/>
+          <w:numId w:val="9"/>
+        </w:numPr>
+        <w:jc w:val="both"/>
+        <w:rPr>
+          <w:rFonts w:cstheme="minorHAnsi"/>
+          <w:b/>
+          <w:bCs/>
+          <w:color w:val="000000" w:themeColor="text1"/>
+          <w:sz w:val="24"/>
+          <w:szCs w:val="24"/>
+        </w:rPr>
+      </w:pPr>
+      <w:r>
+        <w:rPr>
+          <w:rFonts w:cstheme="minorHAnsi"/>
+          <w:color w:val="000000" w:themeColor="text1"/>
+          <w:sz w:val="24"/>
+          <w:szCs w:val="24"/>
+        </w:rPr>
+        <w:t xml:space="preserve">Le preneur est tenu de verser la totalité de la garantie au bailleur à la signature </w:t>
+      </w:r>
+      <w:r>
+        <w:rPr>
+          <w:rFonts w:cstheme="minorHAnsi"/>
+          <w:color w:val="000000" w:themeColor="text1"/>
+          <w:sz w:val="24"/>
+          <w:szCs w:val="24"/>
+        </w:rPr>
+        <w:t xml:space="preserve">du </w:t>
+      </w:r>
+      <w:r>
+        <w:rPr>
+          <w:rFonts w:cstheme="minorHAnsi"/>
+          <w:color w:val="000000" w:themeColor="text1"/>
+          <w:sz w:val="24"/>
+          <w:szCs w:val="24"/>
+        </w:rPr>
+        <w:t>présent</w:t>
+      </w:r>
+      <w:r>
+        <w:rPr>
+          <w:rFonts w:cstheme="minorHAnsi"/>
+          <w:color w:val="000000" w:themeColor="text1"/>
+          <w:sz w:val="24"/>
+          <w:szCs w:val="24"/>
+        </w:rPr>
+        <w:t xml:space="preserve"> contrat moyennant quittance.</w:t>
+      </w:r>
+    </w:p>
+    <w:p>
+      <w:pPr>
+        <w:pStyle w:val="Paragraphedeliste"/>
+        <w:numPr>
+          <w:ilvl w:val="0"/>
+          <w:numId w:val="9"/>
+        </w:numPr>
+        <w:jc w:val="both"/>
+        <w:rPr>
+          <w:rFonts w:cstheme="minorHAnsi"/>
+          <w:b/>
+          <w:bCs/>
+          <w:color w:val="000000" w:themeColor="text1"/>
+          <w:sz w:val="24"/>
+          <w:szCs w:val="24"/>
+        </w:rPr>
+      </w:pPr>
+      <w:r>
+        <w:rPr>
+          <w:rFonts w:cstheme="minorHAnsi"/>
+          <w:color w:val="000000" w:themeColor="text1"/>
+          <w:sz w:val="24"/>
+          <w:szCs w:val="24"/>
+        </w:rPr>
+        <w:t>La garantie locative n’est pas productive d’intérêt, elle est remboursable à la fin du bail après déduction faite de toutes sommes dues au bailleur à quelque titre que ce soit.</w:t>
+      </w:r>
+    </w:p>
+    <w:p>
+      <w:pPr>
+        <w:pStyle w:val="Paragraphedeliste"/>
+        <w:numPr>
+          <w:ilvl w:val="0"/>
+          <w:numId w:val="9"/>
+        </w:numPr>
+        <w:jc w:val="both"/>
+        <w:rPr>
+          <w:rFonts w:cstheme="minorHAnsi"/>
+          <w:b/>
+          <w:bCs/>
+          <w:color w:val="000000" w:themeColor="text1"/>
+          <w:sz w:val="24"/>
+          <w:szCs w:val="24"/>
+        </w:rPr>
+      </w:pPr>
+      <w:r>
+        <w:rPr>
+          <w:rFonts w:cstheme="minorHAnsi"/>
+          <w:color w:val="000000" w:themeColor="text1"/>
+          <w:sz w:val="24"/>
+          <w:szCs w:val="24"/>
+        </w:rPr>
+        <w:t>Le preneur a l’obligation de payer le loyer sans référence aucune à la garantie locative.</w:t>
+      </w:r>
+    </w:p>
+    <w:p>
+      <w:pPr>
+        <w:jc w:val="both"/>
+        <w:rPr>
+          <w:rFonts w:cstheme="minorHAnsi"/>
+          <w:color w:val="000000" w:themeColor="text1"/>
+          <w:sz w:val="24"/>
+          <w:szCs w:val="24"/>
+        </w:rPr>
+      </w:pPr>
+      <w:r>
+        <w:rPr>
+          <w:rFonts w:cstheme="minorHAnsi"/>
+          <w:color w:val="000000" w:themeColor="text1"/>
+          <w:sz w:val="24"/>
+          <w:szCs w:val="24"/>
+        </w:rPr>
+        <w:t>En</w:t>
+      </w:r>
+      <w:r>
+        <w:rPr>
+          <w:rFonts w:cstheme="minorHAnsi"/>
+          <w:b/>
+          <w:bCs/>
+          <w:color w:val="000000" w:themeColor="text1"/>
+          <w:sz w:val="24"/>
+          <w:szCs w:val="24"/>
+        </w:rPr>
+        <w:t xml:space="preserve"> </w:t>
+      </w:r>
+      <w:r>
+        <w:rPr>
+          <w:rFonts w:cstheme="minorHAnsi"/>
+          <w:color w:val="000000" w:themeColor="text1"/>
+          <w:sz w:val="24"/>
+          <w:szCs w:val="24"/>
+        </w:rPr>
+        <w:t>d’autre</w:t>
+      </w:r>
+      <w:r>
+        <w:rPr>
+          <w:rFonts w:cstheme="minorHAnsi"/>
+          <w:color w:val="000000" w:themeColor="text1"/>
+          <w:sz w:val="24"/>
+          <w:szCs w:val="24"/>
+        </w:rPr>
+        <w:t>s</w:t>
+      </w:r>
+      <w:r>
+        <w:rPr>
+          <w:rFonts w:cstheme="minorHAnsi"/>
+          <w:color w:val="000000" w:themeColor="text1"/>
+          <w:sz w:val="24"/>
+          <w:szCs w:val="24"/>
+        </w:rPr>
+        <w:t xml:space="preserve"> termes, la garantie locative ne peut servir de paiement de loyer, de quelque manière que ce soit, elle ne peut en aucun cas être consommée durant la période de bail.</w:t>
+      </w:r>
+    </w:p>
+    <w:p>
+      <w:pPr>
+        <w:jc w:val="both"/>
+        <w:rPr>
+          <w:rFonts w:cstheme="minorHAnsi"/>
+          <w:color w:val="000000" w:themeColor="text1"/>
+          <w:sz w:val="24"/>
+          <w:szCs w:val="24"/>
+        </w:rPr>
+      </w:pPr>
+    </w:p>
+    <w:p>
+      <w:pPr>
+        <w:jc w:val="both"/>
+        <w:rPr>
+          <w:rFonts w:cstheme="minorHAnsi"/>
+          <w:b/>
+          <w:bCs/>
+          <w:color w:val="000000" w:themeColor="text1"/>
+          <w:sz w:val="24"/>
+          <w:szCs w:val="24"/>
+        </w:rPr>
+      </w:pPr>
+      <w:r>
+        <w:rPr>
+          <w:rFonts w:cstheme="minorHAnsi"/>
+          <w:b/>
+          <w:bCs/>
+          <w:color w:val="000000" w:themeColor="text1"/>
+          <w:sz w:val="24"/>
+          <w:szCs w:val="24"/>
+        </w:rPr>
+        <w:t>Article 04 :</w:t>
+      </w:r>
+      <w:r>
+        <w:rPr>
+          <w:rFonts w:cstheme="minorHAnsi"/>
+          <w:b/>
+          <w:bCs/>
+          <w:color w:val="000000" w:themeColor="text1"/>
+          <w:sz w:val="24"/>
+          <w:szCs w:val="24"/>
+        </w:rPr>
+        <w:t xml:space="preserve"> </w:t>
+      </w:r>
+      <w:r>
+        <w:rPr>
+          <w:rFonts w:cstheme="minorHAnsi"/>
+          <w:b/>
+          <w:bCs/>
+          <w:color w:val="000000" w:themeColor="text1"/>
+          <w:sz w:val="24"/>
+          <w:szCs w:val="24"/>
+          <w:u w:val="single"/>
+        </w:rPr>
+        <w:t>IMPOTS ET TAXES</w:t>
+      </w:r>
+      <w:r>
+        <w:rPr>
+          <w:rFonts w:cstheme="minorHAnsi"/>
+          <w:b/>
+          <w:bCs/>
+          <w:color w:val="000000" w:themeColor="text1"/>
+          <w:sz w:val="24"/>
+          <w:szCs w:val="24"/>
+          <w:u w:val="single"/>
+        </w:rPr>
+        <w:t xml:space="preserve"> </w:t>
+      </w:r>
+    </w:p>
+    <w:p>
+      <w:pPr>
+        <w:jc w:val="both"/>
+        <w:rPr>
+          <w:rFonts w:cstheme="minorHAnsi"/>
+          <w:color w:val="000000" w:themeColor="text1"/>
+          <w:sz w:val="24"/>
+          <w:szCs w:val="24"/>
+        </w:rPr>
+      </w:pPr>
+      <w:r>
+        <w:rPr>
+          <w:rFonts w:cstheme="minorHAnsi"/>
+          <w:color w:val="000000" w:themeColor="text1"/>
+          <w:sz w:val="24"/>
+          <w:szCs w:val="24"/>
+        </w:rPr>
+        <w:t xml:space="preserve">Le locataire n’est pas tenu de retenir l’impôt sur le Revenu Locative (IRL) ou de payer toutes autres taxes liées à ce bail, en tant que le loyer constitue le chiffre d’affaires de la Société Société immobilière de gestion, en tant que telle comme le stipule son objectif social.</w:t>
+      </w:r>
+    </w:p>
+    <w:p>
+      <w:pPr>
+        <w:jc w:val="both"/>
+        <w:rPr>
+          <w:rFonts w:cstheme="minorHAnsi"/>
+          <w:color w:val="000000" w:themeColor="text1"/>
+          <w:sz w:val="24"/>
+          <w:szCs w:val="24"/>
+        </w:rPr>
+      </w:pPr>
+      <w:r>
+        <w:rPr>
+          <w:rFonts w:cstheme="minorHAnsi"/>
+          <w:color w:val="000000" w:themeColor="text1"/>
+          <w:sz w:val="24"/>
+          <w:szCs w:val="24"/>
+        </w:rPr>
+        <w:t xml:space="preserve">L’impôt Foncier est à </w:t>
+      </w:r>
+      <w:r>
+        <w:rPr>
+          <w:rFonts w:cstheme="minorHAnsi"/>
+          <w:color w:val="000000" w:themeColor="text1"/>
+          <w:sz w:val="24"/>
+          <w:szCs w:val="24"/>
+          <w:u w:val="single"/>
+        </w:rPr>
+        <w:t>la charge du bailleur.</w:t>
+      </w:r>
+    </w:p>
+    <w:p>
+      <w:pPr>
+        <w:jc w:val="both"/>
+        <w:rPr>
+          <w:rFonts w:cstheme="minorHAnsi"/>
+          <w:b/>
+          <w:bCs/>
+          <w:color w:val="000000" w:themeColor="text1"/>
+          <w:sz w:val="24"/>
+          <w:szCs w:val="24"/>
+        </w:rPr>
+      </w:pPr>
+    </w:p>
+    <w:p>
+      <w:pPr>
+        <w:jc w:val="both"/>
+        <w:rPr>
+          <w:rFonts w:cstheme="minorHAnsi"/>
+          <w:b/>
+          <w:bCs/>
+          <w:color w:val="000000" w:themeColor="text1"/>
+          <w:sz w:val="24"/>
+          <w:szCs w:val="24"/>
+        </w:rPr>
+      </w:pPr>
+    </w:p>
+    <w:p>
+      <w:pPr>
+        <w:jc w:val="both"/>
+        <w:rPr>
+          <w:rFonts w:cstheme="minorHAnsi"/>
+          <w:b/>
+          <w:bCs/>
+          <w:color w:val="000000" w:themeColor="text1"/>
+          <w:sz w:val="24"/>
+          <w:szCs w:val="24"/>
+        </w:rPr>
+      </w:pPr>
+    </w:p>
+    <w:p>
+      <w:pPr>
+        <w:jc w:val="both"/>
+        <w:rPr>
+          <w:rFonts w:cstheme="minorHAnsi"/>
+          <w:b/>
+          <w:bCs/>
+          <w:color w:val="000000" w:themeColor="text1"/>
+          <w:sz w:val="24"/>
+          <w:szCs w:val="24"/>
+        </w:rPr>
+      </w:pPr>
+    </w:p>
+    <w:p>
+      <w:pPr>
+        <w:jc w:val="both"/>
+        <w:rPr>
+          <w:rFonts w:cstheme="minorHAnsi"/>
+          <w:b/>
+          <w:bCs/>
+          <w:color w:val="000000" w:themeColor="text1"/>
+          <w:sz w:val="24"/>
+          <w:szCs w:val="24"/>
+        </w:rPr>
+      </w:pPr>
+      <w:r>
+        <w:rPr>
+          <w:rFonts w:cstheme="minorHAnsi"/>
+          <w:b/>
+          <w:bCs/>
+          <w:color w:val="000000" w:themeColor="text1"/>
+          <w:sz w:val="24"/>
+          <w:szCs w:val="24"/>
+        </w:rPr>
+        <w:lastRenderedPageBreak/>
+        <w:t>A</w:t>
+      </w:r>
+      <w:r>
+        <w:rPr>
+          <w:rFonts w:cstheme="minorHAnsi"/>
+          <w:b/>
+          <w:bCs/>
+          <w:color w:val="000000" w:themeColor="text1"/>
+          <w:sz w:val="24"/>
+          <w:szCs w:val="24"/>
+        </w:rPr>
+        <w:t xml:space="preserve">rticle 05 : </w:t>
+      </w:r>
+      <w:r>
+        <w:rPr>
+          <w:rFonts w:cstheme="minorHAnsi"/>
+          <w:b/>
+          <w:bCs/>
+          <w:color w:val="000000" w:themeColor="text1"/>
+          <w:sz w:val="24"/>
+          <w:szCs w:val="24"/>
+          <w:u w:val="single"/>
+        </w:rPr>
+        <w:t>DE L’INTERDICTION DE LA CESSION, DE LA SOUS-LOCALISATION ET DE LA MODIFICATION</w:t>
+      </w:r>
+      <w:r>
+        <w:rPr>
+          <w:rFonts w:cstheme="minorHAnsi"/>
+          <w:b/>
+          <w:bCs/>
+          <w:color w:val="000000" w:themeColor="text1"/>
+          <w:sz w:val="24"/>
+          <w:szCs w:val="24"/>
+        </w:rPr>
+        <w:t xml:space="preserve"> </w:t>
+      </w:r>
+    </w:p>
+    <w:p>
+      <w:pPr>
+        <w:pStyle w:val="Paragraphedeliste"/>
+        <w:numPr>
+          <w:ilvl w:val="0"/>
+          <w:numId w:val="12"/>
+        </w:numPr>
+        <w:jc w:val="both"/>
+        <w:rPr>
+          <w:rFonts w:cstheme="minorHAnsi"/>
+          <w:color w:val="000000" w:themeColor="text1"/>
+          <w:sz w:val="24"/>
+          <w:szCs w:val="24"/>
+        </w:rPr>
+      </w:pPr>
+      <w:r>
+        <w:rPr>
+          <w:rFonts w:cstheme="minorHAnsi"/>
+          <w:color w:val="000000" w:themeColor="text1"/>
+          <w:sz w:val="24"/>
+          <w:szCs w:val="24"/>
+        </w:rPr>
+        <w:t>Il a interdit au preneur de céder en tout ou en partie du présent contrat ni de sous-louer tout ou une partie des biens loués à un tiers.</w:t>
+      </w:r>
+    </w:p>
+    <w:p>
+      <w:pPr>
+        <w:pStyle w:val="Paragraphedeliste"/>
+        <w:numPr>
+          <w:ilvl w:val="0"/>
+          <w:numId w:val="12"/>
+        </w:numPr>
+        <w:jc w:val="both"/>
+        <w:rPr>
+          <w:rFonts w:cstheme="minorHAnsi"/>
+          <w:color w:val="000000" w:themeColor="text1"/>
+          <w:sz w:val="24"/>
+          <w:szCs w:val="24"/>
+        </w:rPr>
+      </w:pPr>
+      <w:r>
+        <w:rPr>
+          <w:rFonts w:cstheme="minorHAnsi"/>
+          <w:color w:val="000000" w:themeColor="text1"/>
+          <w:sz w:val="24"/>
+          <w:szCs w:val="24"/>
+        </w:rPr>
+        <w:t xml:space="preserve">Il est interdit au preneur de modifier tout </w:t>
+      </w:r>
+      <w:r>
+        <w:rPr>
+          <w:rFonts w:cstheme="minorHAnsi"/>
+          <w:color w:val="000000" w:themeColor="text1"/>
+          <w:sz w:val="24"/>
+          <w:szCs w:val="24"/>
+        </w:rPr>
+        <w:t>ou une partie des biens loués, ni même d’enforcer un clou dans le mur sauf autorisation écrite préalable du bailleur.</w:t>
+      </w:r>
+    </w:p>
+    <w:p>
+      <w:pPr>
+        <w:pStyle w:val="Paragraphedeliste"/>
+        <w:ind w:left="0"/>
+        <w:jc w:val="both"/>
+        <w:rPr>
+          <w:rFonts w:cstheme="minorHAnsi"/>
+          <w:b/>
+          <w:bCs/>
+          <w:color w:val="000000" w:themeColor="text1"/>
+          <w:sz w:val="24"/>
+          <w:szCs w:val="24"/>
+        </w:rPr>
+      </w:pPr>
+    </w:p>
+    <w:p>
+      <w:pPr>
+        <w:pStyle w:val="Paragraphedeliste"/>
+        <w:ind w:left="0"/>
+        <w:jc w:val="both"/>
+        <w:rPr>
+          <w:rFonts w:cstheme="minorHAnsi"/>
+          <w:b/>
+          <w:bCs/>
+          <w:color w:val="000000" w:themeColor="text1"/>
+          <w:sz w:val="24"/>
+          <w:szCs w:val="24"/>
+        </w:rPr>
+      </w:pPr>
+    </w:p>
+    <w:p>
+      <w:pPr>
+        <w:pStyle w:val="Paragraphedeliste"/>
+        <w:ind w:left="0"/>
+        <w:jc w:val="both"/>
+        <w:rPr>
+          <w:rFonts w:cstheme="minorHAnsi"/>
+          <w:b/>
+          <w:bCs/>
+          <w:color w:val="000000" w:themeColor="text1"/>
+          <w:sz w:val="24"/>
+          <w:szCs w:val="24"/>
+          <w:u w:val="single"/>
+        </w:rPr>
+      </w:pPr>
+      <w:r>
+        <w:rPr>
+          <w:rFonts w:cstheme="minorHAnsi"/>
+          <w:b/>
+          <w:bCs/>
+          <w:color w:val="000000" w:themeColor="text1"/>
+          <w:sz w:val="24"/>
+          <w:szCs w:val="24"/>
+        </w:rPr>
+        <w:t xml:space="preserve">Article 06 : </w:t>
+      </w:r>
+      <w:r>
+        <w:rPr>
+          <w:rFonts w:cstheme="minorHAnsi"/>
+          <w:b/>
+          <w:bCs/>
+          <w:color w:val="000000" w:themeColor="text1"/>
+          <w:sz w:val="24"/>
+          <w:szCs w:val="24"/>
+          <w:u w:val="single"/>
+        </w:rPr>
+        <w:t>DE L’ENTRETIEN ET DE NOMBRE D’0CCUPANTS</w:t>
+      </w:r>
+    </w:p>
+    <w:p>
+      <w:pPr>
+        <w:pStyle w:val="Paragraphedeliste"/>
+        <w:ind w:left="0"/>
+        <w:jc w:val="both"/>
+        <w:rPr>
+          <w:rFonts w:cstheme="minorHAnsi"/>
+          <w:b/>
+          <w:bCs/>
+          <w:color w:val="000000" w:themeColor="text1"/>
+          <w:sz w:val="24"/>
+          <w:szCs w:val="24"/>
+          <w:u w:val="single"/>
+        </w:rPr>
+      </w:pPr>
+    </w:p>
+    <w:p>
+      <w:pPr>
+        <w:pStyle w:val="Paragraphedeliste"/>
+        <w:numPr>
+          <w:ilvl w:val="0"/>
+          <w:numId w:val="13"/>
+        </w:numPr>
+        <w:jc w:val="both"/>
+        <w:rPr>
+          <w:rFonts w:cstheme="minorHAnsi"/>
+          <w:color w:val="000000" w:themeColor="text1"/>
+          <w:sz w:val="24"/>
+          <w:szCs w:val="24"/>
+        </w:rPr>
+      </w:pPr>
+      <w:r>
+        <w:rPr>
+          <w:rFonts w:cstheme="minorHAnsi"/>
+          <w:color w:val="000000" w:themeColor="text1"/>
+          <w:sz w:val="24"/>
+          <w:szCs w:val="24"/>
+        </w:rPr>
+        <w:t>Le Preneur tiendra les lieu</w:t>
+      </w:r>
+      <w:r>
+        <w:rPr>
+          <w:rFonts w:cstheme="minorHAnsi"/>
+          <w:color w:val="000000" w:themeColor="text1"/>
+          <w:sz w:val="24"/>
+          <w:szCs w:val="24"/>
+        </w:rPr>
+        <w:t>x loués, leurs aménagements et leurs accessoires en bon état d’entretien, de fonctionnement, de propriété et de réparation locative et jouira du bien loué en bon père de famille ;</w:t>
+      </w:r>
+    </w:p>
+    <w:p>
+      <w:pPr>
+        <w:pStyle w:val="Paragraphedeliste"/>
+        <w:numPr>
+          <w:ilvl w:val="0"/>
+          <w:numId w:val="13"/>
+        </w:numPr>
+        <w:jc w:val="both"/>
+        <w:rPr>
+          <w:rFonts w:cstheme="minorHAnsi"/>
+          <w:color w:val="000000" w:themeColor="text1"/>
+          <w:sz w:val="24"/>
+          <w:szCs w:val="24"/>
+        </w:rPr>
+      </w:pPr>
+      <w:r>
+        <w:rPr>
+          <w:rFonts w:cstheme="minorHAnsi"/>
+          <w:color w:val="000000" w:themeColor="text1"/>
+          <w:sz w:val="24"/>
+          <w:szCs w:val="24"/>
+        </w:rPr>
+        <w:t xml:space="preserve">En cas de besoin, le </w:t>
+      </w:r>
+      <w:r>
+        <w:rPr>
+          <w:rFonts w:cstheme="minorHAnsi"/>
+          <w:color w:val="000000" w:themeColor="text1"/>
+          <w:sz w:val="24"/>
+          <w:szCs w:val="24"/>
+        </w:rPr>
+        <w:t>tenant</w:t>
+      </w:r>
+      <w:r>
+        <w:rPr>
+          <w:rFonts w:cstheme="minorHAnsi"/>
+          <w:color w:val="000000" w:themeColor="text1"/>
+          <w:sz w:val="24"/>
+          <w:szCs w:val="24"/>
+        </w:rPr>
+        <w:t xml:space="preserve"> devra procéder au remplacement des accessoires électriques (ampoules, prises, sockets, interrupteur, et de plomberie (robinets) et ce, sous le contr</w:t>
+      </w:r>
+      <w:r>
+        <w:rPr>
+          <w:rFonts w:cstheme="minorHAnsi"/>
+          <w:color w:val="000000" w:themeColor="text1"/>
+          <w:sz w:val="24"/>
+          <w:szCs w:val="24"/>
+        </w:rPr>
+        <w:t>ôle et la surveillance du bailleur durant toute la période de bail.</w:t>
+      </w:r>
+    </w:p>
+    <w:p>
+      <w:pPr>
+        <w:pStyle w:val="Paragraphedeliste"/>
+        <w:numPr>
+          <w:ilvl w:val="0"/>
+          <w:numId w:val="13"/>
+        </w:numPr>
+        <w:jc w:val="both"/>
+        <w:rPr>
+          <w:rFonts w:cstheme="minorHAnsi"/>
+          <w:color w:val="000000" w:themeColor="text1"/>
+          <w:sz w:val="24"/>
+          <w:szCs w:val="24"/>
+        </w:rPr>
+      </w:pPr>
+      <w:r>
+        <w:rPr>
+          <w:rFonts w:cstheme="minorHAnsi"/>
+          <w:color w:val="000000" w:themeColor="text1"/>
+          <w:sz w:val="24"/>
+          <w:szCs w:val="24"/>
+        </w:rPr>
+        <w:t>Il laissera visiter les lieux à tout moment par le Bailleur ou son représentant et ce, aux époques que celui-ci jugera convenablement à condition d’en prévenir le Preneur deux jours à l’avance et le preneur ne pourra s’opposer à cette visite.</w:t>
+      </w:r>
+    </w:p>
+    <w:p>
+      <w:pPr>
+        <w:pStyle w:val="Paragraphedeliste"/>
+        <w:numPr>
+          <w:ilvl w:val="0"/>
+          <w:numId w:val="13"/>
+        </w:numPr>
+        <w:jc w:val="both"/>
+        <w:rPr>
+          <w:rFonts w:cstheme="minorHAnsi"/>
+          <w:color w:val="000000" w:themeColor="text1"/>
+          <w:sz w:val="24"/>
+          <w:szCs w:val="24"/>
+        </w:rPr>
+      </w:pPr>
+      <w:r>
+        <w:rPr>
+          <w:rFonts w:cstheme="minorHAnsi"/>
+          <w:color w:val="000000" w:themeColor="text1"/>
+          <w:sz w:val="24"/>
+          <w:szCs w:val="24"/>
+        </w:rPr>
+        <w:t xml:space="preserve">Pour occuper un (1) appartement de deux chambres, il n’est autorisé qu’une seule famille. Pour des cas d’occupation individuelle, 2 à 3 personnes célibataires peuvent partager un même appartement.</w:t>
+      </w:r>
+    </w:p>
+    <w:p>
+      <w:pPr>
+        <w:pStyle w:val="Paragraphedeliste"/>
+        <w:numPr>
+          <w:ilvl w:val="0"/>
+          <w:numId w:val="13"/>
+        </w:numPr>
+        <w:jc w:val="both"/>
+        <w:rPr>
+          <w:rFonts w:cstheme="minorHAnsi"/>
+          <w:color w:val="000000" w:themeColor="text1"/>
+          <w:sz w:val="24"/>
+          <w:szCs w:val="24"/>
+        </w:rPr>
+      </w:pPr>
+      <w:r>
+        <w:rPr>
+          <w:rFonts w:cstheme="minorHAnsi"/>
+          <w:color w:val="000000" w:themeColor="text1"/>
+          <w:sz w:val="24"/>
+          <w:szCs w:val="24"/>
+        </w:rPr>
+        <w:t>Un parking est ordinairement réservé à chaque appartement.</w:t>
+      </w:r>
+      <w:r>
+        <w:rPr>
+          <w:rFonts w:cstheme="minorHAnsi"/>
+          <w:color w:val="000000" w:themeColor="text1"/>
+          <w:sz w:val="24"/>
+          <w:szCs w:val="24"/>
+        </w:rPr>
+        <w:t xml:space="preserve"> </w:t>
+      </w:r>
+    </w:p>
+    <w:p>
+      <w:pPr>
+        <w:jc w:val="both"/>
+        <w:rPr>
+          <w:rFonts w:cstheme="minorHAnsi"/>
+          <w:color w:val="000000" w:themeColor="text1"/>
+          <w:sz w:val="24"/>
+          <w:szCs w:val="24"/>
+        </w:rPr>
+      </w:pPr>
+      <w:r>
+        <w:rPr>
+          <w:rFonts w:cstheme="minorHAnsi"/>
+          <w:color w:val="000000" w:themeColor="text1"/>
+          <w:sz w:val="24"/>
+          <w:szCs w:val="24"/>
+        </w:rPr>
+        <w:t xml:space="preserve">A la fin du bail, après constat de l’état des lieux, </w:t>
+      </w:r>
+      <w:r>
+        <w:rPr>
+          <w:rFonts w:cstheme="minorHAnsi"/>
+          <w:color w:val="000000" w:themeColor="text1"/>
+          <w:sz w:val="24"/>
+          <w:szCs w:val="24"/>
+        </w:rPr>
+        <w:t>le preneur est tenu de remettre l’appartement dans l’état où il avait pris. E</w:t>
+      </w:r>
+      <w:r>
+        <w:rPr>
+          <w:rFonts w:cstheme="minorHAnsi"/>
+          <w:color w:val="000000" w:themeColor="text1"/>
+          <w:sz w:val="24"/>
+          <w:szCs w:val="24"/>
+        </w:rPr>
+        <w:t>n</w:t>
+      </w:r>
+      <w:r>
+        <w:rPr>
+          <w:rFonts w:cstheme="minorHAnsi"/>
+          <w:color w:val="000000" w:themeColor="text1"/>
+          <w:sz w:val="24"/>
+          <w:szCs w:val="24"/>
+        </w:rPr>
+        <w:t xml:space="preserve"> espèce, le Bailleur devra rafraîchir les murs des lieux loués ainsi que la réparation des tous dégât que pourra subir l’appartement du fait du preneur aux frais exclusifs du preneur. </w:t>
+      </w:r>
+    </w:p>
+    <w:p>
+      <w:pPr>
+        <w:jc w:val="both"/>
+        <w:rPr>
+          <w:rFonts w:cstheme="minorHAnsi"/>
+          <w:color w:val="000000" w:themeColor="text1"/>
+          <w:sz w:val="24"/>
+          <w:szCs w:val="24"/>
+        </w:rPr>
+      </w:pPr>
+      <w:r>
+        <w:rPr>
+          <w:rFonts w:cstheme="minorHAnsi"/>
+          <w:color w:val="000000" w:themeColor="text1"/>
+          <w:sz w:val="24"/>
+          <w:szCs w:val="24"/>
+        </w:rPr>
+        <w:t>A défaut, le bailleur sera obligé de retenir automatiquement les frais y relatifs après expertise et évaluation du coût</w:t>
+      </w:r>
+      <w:r>
+        <w:rPr>
+          <w:rFonts w:cstheme="minorHAnsi"/>
+          <w:color w:val="000000" w:themeColor="text1"/>
+          <w:sz w:val="24"/>
+          <w:szCs w:val="24"/>
+        </w:rPr>
+        <w:t xml:space="preserve"> des travaux sur la garantie locative même sans l’accord préalable du preneur. La fin du bail ne sera effective que par la remise par la remise par le preneur au bailleur de toutes les clés de l’appartement occupé.</w:t>
+      </w:r>
+    </w:p>
+    <w:p>
+      <w:pPr>
+        <w:jc w:val="both"/>
+        <w:rPr>
+          <w:rFonts w:cstheme="minorHAnsi"/>
+          <w:b/>
+          <w:bCs/>
+          <w:color w:val="000000" w:themeColor="text1"/>
+          <w:sz w:val="24"/>
+          <w:szCs w:val="24"/>
+          <w:u w:val="single"/>
+        </w:rPr>
+      </w:pPr>
+      <w:r>
+        <w:rPr>
+          <w:rFonts w:cstheme="minorHAnsi"/>
+          <w:b/>
+          <w:bCs/>
+          <w:color w:val="000000" w:themeColor="text1"/>
+          <w:sz w:val="24"/>
+          <w:szCs w:val="24"/>
+        </w:rPr>
+        <w:t xml:space="preserve">Article 08 : </w:t>
+      </w:r>
+      <w:r>
+        <w:rPr>
+          <w:rFonts w:cstheme="minorHAnsi"/>
+          <w:b/>
+          <w:bCs/>
+          <w:color w:val="000000" w:themeColor="text1"/>
+          <w:sz w:val="24"/>
+          <w:szCs w:val="24"/>
+          <w:u w:val="single"/>
+        </w:rPr>
+        <w:t>DE L’ASSURANCE</w:t>
+      </w:r>
+    </w:p>
+    <w:p>
+      <w:pPr>
+        <w:jc w:val="both"/>
+        <w:rPr>
+          <w:rFonts w:cstheme="minorHAnsi"/>
+          <w:color w:val="000000" w:themeColor="text1"/>
+          <w:sz w:val="24"/>
+          <w:szCs w:val="24"/>
+        </w:rPr>
+      </w:pPr>
+      <w:r>
+        <w:rPr>
+          <w:rFonts w:cstheme="minorHAnsi"/>
+          <w:color w:val="000000" w:themeColor="text1"/>
+          <w:sz w:val="24"/>
+          <w:szCs w:val="24"/>
+        </w:rPr>
+        <w:t>Sur accord des parties, le preneur souscrit l’assurance-</w:t>
+      </w:r>
+      <w:r>
+        <w:rPr>
+          <w:rFonts w:cstheme="minorHAnsi"/>
+          <w:color w:val="000000" w:themeColor="text1"/>
+          <w:sz w:val="24"/>
+          <w:szCs w:val="24"/>
+        </w:rPr>
+        <w:t xml:space="preserve">incendie devant une compagnie d’assurance de son choix établie à Kinshasa devant couvrir son appartement contre les éventuels risques. </w:t>
+      </w:r>
+    </w:p>
+    <w:p>
+      <w:pPr>
+        <w:jc w:val="both"/>
+        <w:rPr>
+          <w:rFonts w:cstheme="minorHAnsi"/>
+          <w:color w:val="000000" w:themeColor="text1"/>
+          <w:sz w:val="24"/>
+          <w:szCs w:val="24"/>
+        </w:rPr>
+      </w:pPr>
+      <w:r>
+        <w:rPr>
+          <w:rFonts w:cstheme="minorHAnsi"/>
+          <w:color w:val="000000" w:themeColor="text1"/>
+          <w:sz w:val="24"/>
+          <w:szCs w:val="24"/>
+        </w:rPr>
+        <w:t xml:space="preserve">Toutes fois, les réparations ainsi que le remplacement des climatiseurs, ampoules, prises </w:t>
+      </w:r>
+      <w:r>
+        <w:rPr>
+          <w:rFonts w:cstheme="minorHAnsi"/>
+          <w:color w:val="000000" w:themeColor="text1"/>
+          <w:sz w:val="24"/>
+          <w:szCs w:val="24"/>
+        </w:rPr>
+        <w:t>seront à la charge du preneur qui est tenu d’informer au bailleur aussitôt qu’il constatera leur dysfonctionnement.</w:t>
+      </w:r>
+    </w:p>
+    <w:p>
+      <w:pPr>
+        <w:jc w:val="both"/>
+        <w:rPr>
+          <w:rFonts w:cstheme="minorHAnsi"/>
+          <w:color w:val="000000" w:themeColor="text1"/>
+          <w:sz w:val="24"/>
+          <w:szCs w:val="24"/>
+        </w:rPr>
+      </w:pPr>
+      <w:r>
+        <w:rPr>
+          <w:rFonts w:cstheme="minorHAnsi"/>
+          <w:color w:val="000000" w:themeColor="text1"/>
+          <w:sz w:val="24"/>
+          <w:szCs w:val="24"/>
+        </w:rPr>
+        <w:lastRenderedPageBreak/>
+        <w:t>Après évaluation du coût par l’expert du bailleur commis à cet effet, le preneur remettra au bailleur le jour suivant les frais nécessaires pour leur mise en état.</w:t>
+      </w:r>
+    </w:p>
+    <w:p>
+      <w:pPr>
+        <w:jc w:val="both"/>
+        <w:rPr>
+          <w:rFonts w:cstheme="minorHAnsi"/>
+          <w:color w:val="000000" w:themeColor="text1"/>
+          <w:sz w:val="24"/>
+          <w:szCs w:val="24"/>
+        </w:rPr>
+      </w:pPr>
+    </w:p>
+    <w:p>
+      <w:pPr>
+        <w:jc w:val="both"/>
+        <w:rPr>
+          <w:rFonts w:cstheme="minorHAnsi"/>
+          <w:b/>
+          <w:bCs/>
+          <w:color w:val="000000" w:themeColor="text1"/>
+          <w:sz w:val="24"/>
+          <w:szCs w:val="24"/>
+        </w:rPr>
+      </w:pPr>
+      <w:r>
+        <w:rPr>
+          <w:rFonts w:cstheme="minorHAnsi"/>
+          <w:b/>
+          <w:bCs/>
+          <w:color w:val="000000" w:themeColor="text1"/>
+          <w:sz w:val="24"/>
+          <w:szCs w:val="24"/>
+        </w:rPr>
+        <w:t>Article 09 </w:t>
+      </w:r>
+      <w:r>
+        <w:rPr>
+          <w:rFonts w:cstheme="minorHAnsi"/>
+          <w:b/>
+          <w:bCs/>
+          <w:color w:val="000000" w:themeColor="text1"/>
+          <w:sz w:val="24"/>
+          <w:szCs w:val="24"/>
+          <w:u w:val="single"/>
+        </w:rPr>
+        <w:t>: DU NON-RESPECT DES CLAUSES</w:t>
+      </w:r>
+      <w:r>
+        <w:rPr>
+          <w:rFonts w:cstheme="minorHAnsi"/>
+          <w:b/>
+          <w:bCs/>
+          <w:color w:val="000000" w:themeColor="text1"/>
+          <w:sz w:val="24"/>
+          <w:szCs w:val="24"/>
+        </w:rPr>
+        <w:t xml:space="preserve"> </w:t>
+      </w:r>
+    </w:p>
+    <w:p>
+      <w:pPr>
+        <w:pStyle w:val="Paragraphedeliste"/>
+        <w:numPr>
+          <w:ilvl w:val="0"/>
+          <w:numId w:val="16"/>
+        </w:numPr>
+        <w:jc w:val="both"/>
+        <w:rPr>
+          <w:rFonts w:cstheme="minorHAnsi"/>
+          <w:color w:val="000000" w:themeColor="text1"/>
+          <w:sz w:val="24"/>
+          <w:szCs w:val="24"/>
+        </w:rPr>
+      </w:pPr>
+      <w:r>
+        <w:rPr>
+          <w:rFonts w:cstheme="minorHAnsi"/>
+          <w:color w:val="000000" w:themeColor="text1"/>
+          <w:sz w:val="24"/>
+          <w:szCs w:val="24"/>
+        </w:rPr>
+        <w:t xml:space="preserve">En cas de non-respect de l’une des clauses, le bailleur peut résilier le contrat de bail moyennant un préavis de 3 mois ;</w:t>
+      </w:r>
+    </w:p>
+    <w:p>
+      <w:pPr>
+        <w:pStyle w:val="Paragraphedeliste"/>
+        <w:numPr>
+          <w:ilvl w:val="0"/>
+          <w:numId w:val="16"/>
+        </w:numPr>
+        <w:jc w:val="both"/>
+        <w:rPr>
+          <w:rFonts w:cstheme="minorHAnsi"/>
+          <w:color w:val="000000" w:themeColor="text1"/>
+          <w:sz w:val="24"/>
+          <w:szCs w:val="24"/>
+        </w:rPr>
+      </w:pPr>
+      <w:r>
+        <w:rPr>
+          <w:rFonts w:cstheme="minorHAnsi"/>
+          <w:color w:val="000000" w:themeColor="text1"/>
+          <w:sz w:val="24"/>
+          <w:szCs w:val="24"/>
+        </w:rPr>
+        <w:t>Si l’une des dispositions n’a pas été prise en compte dans le présent contrat, les parties conviennent de se référer à la loi n° 15/025 du 31 décembre 2015 relative aux baux à loyer non professionnels.</w:t>
+      </w:r>
+    </w:p>
+    <w:p>
+      <w:pPr>
+        <w:pStyle w:val="Paragraphedeliste"/>
+        <w:numPr>
+          <w:ilvl w:val="0"/>
+          <w:numId w:val="16"/>
+        </w:numPr>
+        <w:jc w:val="both"/>
+        <w:rPr>
+          <w:rFonts w:cstheme="minorHAnsi"/>
+          <w:color w:val="000000" w:themeColor="text1"/>
+          <w:sz w:val="24"/>
+          <w:szCs w:val="24"/>
+        </w:rPr>
+      </w:pPr>
+      <w:r>
+        <w:rPr>
+          <w:rFonts w:cstheme="minorHAnsi"/>
+          <w:color w:val="000000" w:themeColor="text1"/>
+          <w:sz w:val="24"/>
+          <w:szCs w:val="24"/>
+        </w:rPr>
+        <w:t>En cas d’abus grave</w:t>
+      </w:r>
+      <w:r>
+        <w:rPr>
+          <w:rFonts w:cstheme="minorHAnsi"/>
+          <w:color w:val="000000" w:themeColor="text1"/>
+          <w:sz w:val="24"/>
+          <w:szCs w:val="24"/>
+        </w:rPr>
+        <w:t>, le bailleur a le droit de résilier le contrat avec un effet immédiat.</w:t>
+      </w:r>
+    </w:p>
+    <w:p>
+      <w:pPr>
+        <w:pStyle w:val="Paragraphedeliste"/>
+        <w:jc w:val="both"/>
+        <w:rPr>
+          <w:rFonts w:cstheme="minorHAnsi"/>
+          <w:color w:val="000000" w:themeColor="text1"/>
+          <w:sz w:val="24"/>
+          <w:szCs w:val="24"/>
+        </w:rPr>
+      </w:pPr>
+    </w:p>
+    <w:p>
+      <w:pPr>
+        <w:jc w:val="both"/>
+        <w:rPr>
+          <w:rFonts w:cstheme="minorHAnsi"/>
+          <w:b/>
+          <w:bCs/>
+          <w:color w:val="000000" w:themeColor="text1"/>
+          <w:sz w:val="24"/>
+          <w:szCs w:val="24"/>
+        </w:rPr>
+      </w:pPr>
+      <w:r>
+        <w:rPr>
+          <w:rFonts w:cstheme="minorHAnsi"/>
+          <w:b/>
+          <w:bCs/>
+          <w:color w:val="000000" w:themeColor="text1"/>
+          <w:sz w:val="24"/>
+          <w:szCs w:val="24"/>
+        </w:rPr>
+        <w:t xml:space="preserve">Article 10 : </w:t>
+      </w:r>
+      <w:r>
+        <w:rPr>
+          <w:rFonts w:cstheme="minorHAnsi"/>
+          <w:b/>
+          <w:bCs/>
+          <w:color w:val="000000" w:themeColor="text1"/>
+          <w:sz w:val="24"/>
+          <w:szCs w:val="24"/>
+          <w:u w:val="single"/>
+        </w:rPr>
+        <w:t>DE LA MODIFICATION DU CONTRAT</w:t>
+      </w:r>
+      <w:r>
+        <w:rPr>
+          <w:rFonts w:cstheme="minorHAnsi"/>
+          <w:b/>
+          <w:bCs/>
+          <w:color w:val="000000" w:themeColor="text1"/>
+          <w:sz w:val="24"/>
+          <w:szCs w:val="24"/>
+        </w:rPr>
+        <w:t> </w:t>
+      </w:r>
+    </w:p>
+    <w:p>
+      <w:pPr>
+        <w:jc w:val="both"/>
+        <w:rPr>
+          <w:rFonts w:cstheme="minorHAnsi"/>
+          <w:color w:val="000000" w:themeColor="text1"/>
+          <w:sz w:val="24"/>
+          <w:szCs w:val="24"/>
+        </w:rPr>
+      </w:pPr>
+      <w:r>
+        <w:rPr>
+          <w:rFonts w:cstheme="minorHAnsi"/>
+          <w:color w:val="000000" w:themeColor="text1"/>
+          <w:sz w:val="24"/>
+          <w:szCs w:val="24"/>
+        </w:rPr>
+        <w:t>Toute modification du présent contrat de bail fera l’objectif d’un avenant signé par les deux parties et sera annexé au présent Contrat de bail.</w:t>
+      </w:r>
+    </w:p>
+    <w:p>
+      <w:pPr>
+        <w:jc w:val="both"/>
+        <w:rPr>
+          <w:rFonts w:cstheme="minorHAnsi"/>
+          <w:b/>
+          <w:bCs/>
+          <w:color w:val="000000" w:themeColor="text1"/>
+          <w:sz w:val="24"/>
+          <w:szCs w:val="24"/>
+        </w:rPr>
+      </w:pPr>
+    </w:p>
+    <w:p>
+      <w:pPr>
+        <w:jc w:val="both"/>
+        <w:rPr>
+          <w:rFonts w:cstheme="minorHAnsi"/>
+          <w:b/>
+          <w:bCs/>
+          <w:color w:val="000000" w:themeColor="text1"/>
+          <w:sz w:val="24"/>
+          <w:szCs w:val="24"/>
+        </w:rPr>
+      </w:pPr>
+      <w:r>
+        <w:rPr>
+          <w:rFonts w:cstheme="minorHAnsi"/>
+          <w:b/>
+          <w:bCs/>
+          <w:color w:val="000000" w:themeColor="text1"/>
+          <w:sz w:val="24"/>
+          <w:szCs w:val="24"/>
+        </w:rPr>
+        <w:t>Article</w:t>
+      </w:r>
+      <w:r>
+        <w:rPr>
+          <w:rFonts w:cstheme="minorHAnsi"/>
+          <w:b/>
+          <w:bCs/>
+          <w:color w:val="000000" w:themeColor="text1"/>
+          <w:sz w:val="24"/>
+          <w:szCs w:val="24"/>
+        </w:rPr>
+        <w:t xml:space="preserve"> 11 </w:t>
+      </w:r>
+      <w:r>
+        <w:rPr>
+          <w:rFonts w:cstheme="minorHAnsi"/>
+          <w:b/>
+          <w:bCs/>
+          <w:color w:val="000000" w:themeColor="text1"/>
+          <w:sz w:val="24"/>
+          <w:szCs w:val="24"/>
+          <w:u w:val="single"/>
+        </w:rPr>
+        <w:t>: DE LA CONCLUSION</w:t>
+      </w:r>
+      <w:r>
+        <w:rPr>
+          <w:rFonts w:cstheme="minorHAnsi"/>
+          <w:b/>
+          <w:bCs/>
+          <w:color w:val="000000" w:themeColor="text1"/>
+          <w:sz w:val="24"/>
+          <w:szCs w:val="24"/>
+        </w:rPr>
+        <w:t xml:space="preserve"> </w:t>
+      </w:r>
+      <w:r>
+        <w:rPr>
+          <w:rFonts w:cstheme="minorHAnsi"/>
+          <w:b/>
+          <w:bCs/>
+          <w:color w:val="000000" w:themeColor="text1"/>
+          <w:sz w:val="24"/>
+          <w:szCs w:val="24"/>
+        </w:rPr>
+        <w:t xml:space="preserve"> </w:t>
+      </w:r>
+    </w:p>
+    <w:p>
+      <w:pPr>
+        <w:jc w:val="both"/>
+        <w:rPr>
+          <w:sz w:val="24"/>
+          <w:szCs w:val="24"/>
+        </w:rPr>
+      </w:pPr>
+      <w:r>
+        <w:rPr>
+          <w:sz w:val="24"/>
+          <w:szCs w:val="24"/>
+        </w:rPr>
+        <w:t xml:space="preserve">Les parties fourniront leurs meilleurs efforts en vue du règlement à l’amiable de tout litige qui pourrait </w:t>
+      </w:r>
+      <w:r>
+        <w:rPr>
+          <w:sz w:val="24"/>
+          <w:szCs w:val="24"/>
+        </w:rPr>
+        <w:t>surgir</w:t>
+      </w:r>
+      <w:r>
+        <w:rPr>
+          <w:sz w:val="24"/>
+          <w:szCs w:val="24"/>
+        </w:rPr>
+        <w:t xml:space="preserve"> ou qui serait en relation avec l’exécution ou l’interprétation du, présent bail avant toute saisine judiciaire.</w:t>
+      </w:r>
+    </w:p>
+    <w:p>
+      <w:pPr>
+        <w:jc w:val="both"/>
+        <w:rPr>
+          <w:sz w:val="24"/>
+          <w:szCs w:val="24"/>
+        </w:rPr>
+      </w:pPr>
+      <w:r>
+        <w:rPr>
+          <w:sz w:val="24"/>
+          <w:szCs w:val="24"/>
+        </w:rPr>
+        <w:t xml:space="preserve">Tous les litiges entre les parties seront règles </w:t>
+      </w:r>
+      <w:proofErr w:type="spellStart"/>
+      <w:r>
+        <w:rPr>
+          <w:sz w:val="24"/>
+          <w:szCs w:val="24"/>
+        </w:rPr>
+        <w:t>a</w:t>
+      </w:r>
+      <w:proofErr w:type="spellEnd"/>
+      <w:r>
+        <w:rPr>
+          <w:sz w:val="24"/>
+          <w:szCs w:val="24"/>
+        </w:rPr>
+        <w:t xml:space="preserve"> </w:t>
+      </w:r>
+      <w:r>
+        <w:rPr>
+          <w:sz w:val="24"/>
+          <w:szCs w:val="24"/>
+        </w:rPr>
+        <w:t>l’amiable,</w:t>
+      </w:r>
+      <w:r>
+        <w:rPr>
+          <w:sz w:val="24"/>
+          <w:szCs w:val="24"/>
+        </w:rPr>
+        <w:t xml:space="preserve"> a </w:t>
+      </w:r>
+      <w:r>
+        <w:rPr>
+          <w:sz w:val="24"/>
+          <w:szCs w:val="24"/>
+        </w:rPr>
+        <w:t>défauts seuls</w:t>
+      </w:r>
+      <w:r>
+        <w:rPr>
+          <w:sz w:val="24"/>
+          <w:szCs w:val="24"/>
+        </w:rPr>
+        <w:t xml:space="preserve"> les Cours et Tribunaux de Kinshasa sont compétents pour </w:t>
+      </w:r>
+      <w:r>
+        <w:rPr>
+          <w:sz w:val="24"/>
+          <w:szCs w:val="24"/>
+        </w:rPr>
+        <w:t>l</w:t>
+      </w:r>
+      <w:r>
+        <w:rPr>
+          <w:sz w:val="24"/>
+          <w:szCs w:val="24"/>
+        </w:rPr>
+        <w:t>eurs</w:t>
+      </w:r>
+      <w:r>
+        <w:rPr>
+          <w:sz w:val="24"/>
+          <w:szCs w:val="24"/>
+        </w:rPr>
+        <w:t xml:space="preserve"> résolutions</w:t>
+      </w:r>
+      <w:r>
+        <w:rPr>
+          <w:sz w:val="24"/>
+          <w:szCs w:val="24"/>
+        </w:rPr>
+        <w:t>.</w:t>
+      </w:r>
+      <w:r>
+        <w:rPr>
+          <w:sz w:val="24"/>
+          <w:szCs w:val="24"/>
+        </w:rPr>
+        <w:t xml:space="preserve"> </w:t>
+      </w:r>
+    </w:p>
+    <w:p>
+      <w:pPr>
+        <w:jc w:val="both"/>
+        <w:rPr>
+          <w:sz w:val="24"/>
+          <w:szCs w:val="24"/>
+        </w:rPr>
+      </w:pPr>
+      <w:r>
+        <w:rPr>
+          <w:sz w:val="24"/>
+          <w:szCs w:val="24"/>
+        </w:rPr>
+        <w:t>Ainsi, fait à Kinshasa en deux exemplaires, les parties reconnaissent le sein en date d</w:t>
+      </w:r>
+      <w:r>
+        <w:rPr>
+          <w:sz w:val="24"/>
+          <w:szCs w:val="24"/>
+        </w:rPr>
+        <w:t>e signature.</w:t>
+      </w:r>
+    </w:p>
+    <w:p>
+      <w:pPr>
+        <w:jc w:val="both"/>
+        <w:rPr>
+          <w:rFonts w:cstheme="minorHAnsi"/>
+          <w:color w:val="000000" w:themeColor="text1"/>
+          <w:sz w:val="24"/>
+          <w:szCs w:val="24"/>
+        </w:rPr>
+      </w:pPr>
+    </w:p>
+    <w:p>
+      <w:pPr>
+        <w:spacing w:line="480" w:lineRule="auto"/>
+        <w:jc w:val="both"/>
+        <w:rPr>
+          <w:rFonts w:cstheme="minorHAnsi"/>
+          <w:b/>
+          <w:bCs/>
+          <w:color w:val="000000" w:themeColor="text1"/>
+          <w:sz w:val="24"/>
+          <w:szCs w:val="24"/>
+        </w:rPr>
+      </w:pPr>
+      <w:r>
+        <w:rPr>
+          <w:rFonts w:cstheme="minorHAnsi"/>
+          <w:color w:val="000000" w:themeColor="text1"/>
+          <w:sz w:val="24"/>
+          <w:szCs w:val="24"/>
+        </w:rPr>
+        <w:t xml:space="preserve">Fait à Kinshasa, le 12/07/2026</w:t>
+      </w:r>
+    </w:p>
+    <w:p>
+      <w:pPr>
+        <w:jc w:val="both"/>
+        <w:rPr>
+          <w:rFonts w:cstheme="minorHAnsi"/>
+          <w:color w:val="000000" w:themeColor="text1"/>
+          <w:sz w:val="24"/>
+          <w:szCs w:val="24"/>
+        </w:rPr>
+      </w:pPr>
+    </w:p>
+    <w:p>
+      <w:pPr>
+        <w:jc w:val="both"/>
+        <w:rPr>
+          <w:rFonts w:cstheme="minorHAnsi"/>
+          <w:b/>
+          <w:bCs/>
+          <w:color w:val="000000" w:themeColor="text1"/>
+          <w:sz w:val="24"/>
+          <w:szCs w:val="24"/>
+        </w:rPr>
+      </w:pPr>
+    </w:p>
+    <w:p>
+      <w:pPr>
+        <w:jc w:val="both"/>
+        <w:rPr>
+          <w:rFonts w:cstheme="minorHAnsi"/>
+          <w:b/>
+          <w:bCs/>
+          <w:color w:val="000000" w:themeColor="text1"/>
+          <w:sz w:val="24"/>
+          <w:szCs w:val="24"/>
+        </w:rPr>
+      </w:pPr>
+      <w:r>
+        <w:rPr>
+          <w:rFonts w:cstheme="minorHAnsi"/>
+          <w:b/>
+          <w:bCs/>
+          <w:color w:val="000000" w:themeColor="text1"/>
+          <w:sz w:val="24"/>
+          <w:szCs w:val="24"/>
+        </w:rPr>
+        <w:t>LE PRENEUR                                                                                                              LE BAILLEUR</w:t>
+      </w:r>
+    </w:p>
+    <w:p>
+      <w:pPr>
+        <w:rPr>
+          <w:rFonts w:cstheme="minorHAnsi"/>
+          <w:color w:val="000000" w:themeColor="text1"/>
+          <w:sz w:val="24"/>
+          <w:szCs w:val="24"/>
+        </w:rPr>
+      </w:pPr>
+    </w:p>
+    <w:p>
+      <w:pPr>
+        <w:rPr>
+          <w:rFonts w:cstheme="minorHAnsi"/>
+          <w:color w:val="000000" w:themeColor="text1"/>
+          <w:sz w:val="24"/>
+          <w:szCs w:val="24"/>
+        </w:rPr>
+      </w:pPr>
+      <w:r>
+        <w:rPr>
+          <w:rFonts w:cstheme="minorHAnsi"/>
+          <w:color w:val="000000" w:themeColor="text1"/>
+          <w:sz w:val="24"/>
+          <w:szCs w:val="24"/>
+        </w:rPr>
+        <w:t xml:space="preserve"> </w:t>
+      </w:r>
+    </w:p>
+    <w:p>
+      <w:pPr>
+        <w:rPr>
+          <w:rFonts w:cstheme="minorHAnsi"/>
+          <w:color w:val="000000" w:themeColor="text1"/>
+          <w:sz w:val="24"/>
+          <w:szCs w:val="24"/>
+        </w:rPr>
+      </w:pPr>
+    </w:p>
+    <w:p/>
+    <w:p>
+      <w:r>
+        <w:t xml:space="preserve"> </w:t>
+      </w:r>
+    </w:p>
     <w:sectPr>
       <w:pgSz w:w="11906" w:h="16838"/>
       <w:pgMar w:top="1417" w:right="1417" w:bottom="1417" w:left="1417" w:header="708" w:footer="708" w:gutter="0"/>

</xml_diff>